<commit_message>
Rebuild photographed forms as line art plus reliable text
Pages with many ruled boxes (e.g. a T4 slip) become one transparent
picture of the form's rules and print, with each recognized line placed
as an exact text box on top (Word text boxes, PowerPoint shapes, Excel
drawing shapes). Text is made editable only when it reads reliably:
spelled correctly in English or French, or confirmed by a second reading
for larger entries; anything else stays in the picture as printed, and
the picture loses exactly the ink of the text drawn over it.

Also: flattening keeps the paper's true aspect (Letter/A4 snap), wood
desks no longer pass as paper when extending to edges, and false rules
inside bold text are ignored.

Co-Authored-By: Claude Opus 5.5 <noreply@anthropic.com>
Claude-Session: https://claude.ai/code/session_01N2KPqXq9Whv7eR2vrvkBWC
</commit_message>
<xml_diff>
--- a/ios/Verification/office-layout/OfficeSamplePhoto.docx
+++ b/ios/Verification/office-layout/OfficeSamplePhoto.docx
@@ -1,6 +1,6 @@
 
 <file path=word/document.xml><?xml version="1.0" encoding="utf-8"?>
-<w:document xmlns:w="http://schemas.openxmlformats.org/wordprocessingml/2006/main" xmlns:r="http://schemas.openxmlformats.org/officeDocument/2006/relationships" xmlns:wp="http://schemas.openxmlformats.org/drawingml/2006/wordprocessingDrawing" xmlns:a="http://schemas.openxmlformats.org/drawingml/2006/main" xmlns:pic="http://schemas.openxmlformats.org/drawingml/2006/picture">
+<w:document xmlns:w="http://schemas.openxmlformats.org/wordprocessingml/2006/main" xmlns:r="http://schemas.openxmlformats.org/officeDocument/2006/relationships" xmlns:wp="http://schemas.openxmlformats.org/drawingml/2006/wordprocessingDrawing" xmlns:a="http://schemas.openxmlformats.org/drawingml/2006/main" xmlns:pic="http://schemas.openxmlformats.org/drawingml/2006/picture" xmlns:wps="http://schemas.microsoft.com/office/word/2010/wordprocessingShape">
   <w:body>
     <w:p>
       <w:pPr>
@@ -239,8 +239,8 @@
       </w:tblPr>
       <w:tblGrid>
         <w:gridCol w:w="2764"/>
-        <w:gridCol w:w="1763"/>
-        <w:gridCol w:w="2180"/>
+        <w:gridCol w:w="1766"/>
+        <w:gridCol w:w="2177"/>
         <w:gridCol w:w="2095"/>
       </w:tblGrid>
       <w:tr>
@@ -277,7 +277,7 @@
         </w:tc>
         <w:tc>
           <w:tcPr>
-            <w:tcW w:w="1763" w:type="dxa"/>
+            <w:tcW w:w="1766" w:type="dxa"/>
             <w:tcBorders>
               <w:top w:val="nil"/>
               <w:left w:val="nil"/>
@@ -304,7 +304,7 @@
         </w:tc>
         <w:tc>
           <w:tcPr>
-            <w:tcW w:w="2180" w:type="dxa"/>
+            <w:tcW w:w="2177" w:type="dxa"/>
             <w:tcBorders>
               <w:top w:val="nil"/>
               <w:left w:val="nil"/>
@@ -390,7 +390,7 @@
         </w:tc>
         <w:tc>
           <w:tcPr>
-            <w:tcW w:w="1763" w:type="dxa"/>
+            <w:tcW w:w="1766" w:type="dxa"/>
             <w:tcBorders>
               <w:top w:val="nil"/>
               <w:left w:val="nil"/>
@@ -416,27 +416,27 @@
         </w:tc>
         <w:tc>
           <w:tcPr>
-            <w:tcW w:w="2180" w:type="dxa"/>
-            <w:tcBorders>
-              <w:top w:val="nil"/>
-              <w:left w:val="nil"/>
-              <w:bottom w:val="nil"/>
-              <w:right w:val="nil"/>
-            </w:tcBorders>
-            <w:vAlign w:val="center"/>
-          </w:tcPr>
-          <w:p>
-            <w:pPr>
-              <w:spacing w:before="0" w:after="0" w:line="240" w:lineRule="auto"/>
-              <w:jc w:val="left"/>
-            </w:pPr>
-            <w:r>
-              <w:rPr>
-                <w:rFonts w:ascii="Arial" w:hAnsi="Arial" w:eastAsia="Malgun Gothic" w:cs="Arial"/>
-                <w:sz w:val="24"/>
-                <w:szCs w:val="24"/>
-              </w:rPr>
-              <w:t xml:space="preserve">476-479</w:t>
+            <w:tcW w:w="2177" w:type="dxa"/>
+            <w:tcBorders>
+              <w:top w:val="nil"/>
+              <w:left w:val="nil"/>
+              <w:bottom w:val="nil"/>
+              <w:right w:val="nil"/>
+            </w:tcBorders>
+            <w:vAlign w:val="center"/>
+          </w:tcPr>
+          <w:p>
+            <w:pPr>
+              <w:spacing w:before="0" w:after="0" w:line="240" w:lineRule="auto"/>
+              <w:jc w:val="left"/>
+            </w:pPr>
+            <w:r>
+              <w:rPr>
+                <w:rFonts w:ascii="Arial" w:hAnsi="Arial" w:eastAsia="Malgun Gothic" w:cs="Arial"/>
+                <w:sz w:val="24"/>
+                <w:szCs w:val="24"/>
+              </w:rPr>
+              <w:t xml:space="preserve">476 - 479</w:t>
             </w:r>
           </w:p>
         </w:tc>
@@ -494,7 +494,7 @@
         </w:tc>
         <w:tc>
           <w:tcPr>
-            <w:tcW w:w="1763" w:type="dxa"/>
+            <w:tcW w:w="1766" w:type="dxa"/>
             <w:tcBorders>
               <w:top w:val="nil"/>
               <w:left w:val="nil"/>
@@ -520,7 +520,7 @@
         </w:tc>
         <w:tc>
           <w:tcPr>
-            <w:tcW w:w="2180" w:type="dxa"/>
+            <w:tcW w:w="2177" w:type="dxa"/>
             <w:tcBorders>
               <w:top w:val="nil"/>
               <w:left w:val="nil"/>
@@ -604,7 +604,7 @@
         </w:tc>
         <w:tc>
           <w:tcPr>
-            <w:tcW w:w="1763" w:type="dxa"/>
+            <w:tcW w:w="1766" w:type="dxa"/>
             <w:tcBorders>
               <w:top w:val="nil"/>
               <w:left w:val="nil"/>
@@ -630,27 +630,27 @@
         </w:tc>
         <w:tc>
           <w:tcPr>
-            <w:tcW w:w="2180" w:type="dxa"/>
-            <w:tcBorders>
-              <w:top w:val="nil"/>
-              <w:left w:val="nil"/>
-              <w:bottom w:val="nil"/>
-              <w:right w:val="nil"/>
-            </w:tcBorders>
-            <w:vAlign w:val="center"/>
-          </w:tcPr>
-          <w:p>
-            <w:pPr>
-              <w:spacing w:before="0" w:after="0" w:line="240" w:lineRule="auto"/>
-              <w:jc w:val="left"/>
-            </w:pPr>
-            <w:r>
-              <w:rPr>
-                <w:rFonts w:ascii="Arial" w:hAnsi="Arial" w:eastAsia="Malgun Gothic" w:cs="Arial"/>
-                <w:sz w:val="24"/>
-                <w:szCs w:val="24"/>
-              </w:rPr>
-              <w:t xml:space="preserve">644-769</w:t>
+            <w:tcW w:w="2177" w:type="dxa"/>
+            <w:tcBorders>
+              <w:top w:val="nil"/>
+              <w:left w:val="nil"/>
+              <w:bottom w:val="nil"/>
+              <w:right w:val="nil"/>
+            </w:tcBorders>
+            <w:vAlign w:val="center"/>
+          </w:tcPr>
+          <w:p>
+            <w:pPr>
+              <w:spacing w:before="0" w:after="0" w:line="240" w:lineRule="auto"/>
+              <w:jc w:val="left"/>
+            </w:pPr>
+            <w:r>
+              <w:rPr>
+                <w:rFonts w:ascii="Arial" w:hAnsi="Arial" w:eastAsia="Malgun Gothic" w:cs="Arial"/>
+                <w:sz w:val="24"/>
+                <w:szCs w:val="24"/>
+              </w:rPr>
+              <w:t xml:space="preserve">644 - 769</w:t>
             </w:r>
           </w:p>
         </w:tc>
@@ -683,7 +683,7 @@
       </w:tr>
       <w:tr>
         <w:trPr>
-          <w:trHeight w:val="461" w:hRule="exact"/>
+          <w:trHeight w:val="463" w:hRule="exact"/>
           <w:cantSplit/>
         </w:trPr>
         <w:tc>
@@ -714,7 +714,7 @@
         </w:tc>
         <w:tc>
           <w:tcPr>
-            <w:tcW w:w="1763" w:type="dxa"/>
+            <w:tcW w:w="1766" w:type="dxa"/>
             <w:tcBorders>
               <w:top w:val="nil"/>
               <w:left w:val="nil"/>
@@ -740,27 +740,27 @@
         </w:tc>
         <w:tc>
           <w:tcPr>
-            <w:tcW w:w="2180" w:type="dxa"/>
-            <w:tcBorders>
-              <w:top w:val="nil"/>
-              <w:left w:val="nil"/>
-              <w:bottom w:val="nil"/>
-              <w:right w:val="nil"/>
-            </w:tcBorders>
-            <w:vAlign w:val="center"/>
-          </w:tcPr>
-          <w:p>
-            <w:pPr>
-              <w:spacing w:before="0" w:after="0" w:line="240" w:lineRule="auto"/>
-              <w:jc w:val="left"/>
-            </w:pPr>
-            <w:r>
-              <w:rPr>
-                <w:rFonts w:ascii="Arial" w:hAnsi="Arial" w:eastAsia="Malgun Gothic" w:cs="Arial"/>
-                <w:sz w:val="24"/>
-                <w:szCs w:val="24"/>
-              </w:rPr>
-              <w:t xml:space="preserve">801-989</w:t>
+            <w:tcW w:w="2177" w:type="dxa"/>
+            <w:tcBorders>
+              <w:top w:val="nil"/>
+              <w:left w:val="nil"/>
+              <w:bottom w:val="nil"/>
+              <w:right w:val="nil"/>
+            </w:tcBorders>
+            <w:vAlign w:val="center"/>
+          </w:tcPr>
+          <w:p>
+            <w:pPr>
+              <w:spacing w:before="0" w:after="0" w:line="240" w:lineRule="auto"/>
+              <w:jc w:val="left"/>
+            </w:pPr>
+            <w:r>
+              <w:rPr>
+                <w:rFonts w:ascii="Arial" w:hAnsi="Arial" w:eastAsia="Malgun Gothic" w:cs="Arial"/>
+                <w:sz w:val="24"/>
+                <w:szCs w:val="24"/>
+              </w:rPr>
+              <w:t xml:space="preserve">801 - 989</w:t>
             </w:r>
           </w:p>
         </w:tc>
@@ -793,7 +793,7 @@
       </w:tr>
       <w:tr>
         <w:trPr>
-          <w:trHeight w:val="495" w:hRule="exact"/>
+          <w:trHeight w:val="490" w:hRule="exact"/>
           <w:cantSplit/>
         </w:trPr>
         <w:tc>
@@ -824,7 +824,7 @@
         </w:tc>
         <w:tc>
           <w:tcPr>
-            <w:tcW w:w="1763" w:type="dxa"/>
+            <w:tcW w:w="1766" w:type="dxa"/>
             <w:tcBorders>
               <w:top w:val="nil"/>
               <w:left w:val="nil"/>
@@ -850,7 +850,7 @@
         </w:tc>
         <w:tc>
           <w:tcPr>
-            <w:tcW w:w="2180" w:type="dxa"/>
+            <w:tcW w:w="2177" w:type="dxa"/>
             <w:tcBorders>
               <w:top w:val="nil"/>
               <w:left w:val="nil"/>
@@ -903,7 +903,7 @@
       </w:tr>
       <w:tr>
         <w:trPr>
-          <w:trHeight w:val="489" w:hRule="exact"/>
+          <w:trHeight w:val="491" w:hRule="exact"/>
           <w:cantSplit/>
         </w:trPr>
         <w:tc>
@@ -934,33 +934,33 @@
         </w:tc>
         <w:tc>
           <w:tcPr>
-            <w:tcW w:w="1763" w:type="dxa"/>
-            <w:tcBorders>
-              <w:top w:val="nil"/>
-              <w:left w:val="nil"/>
-              <w:bottom w:val="nil"/>
-              <w:right w:val="nil"/>
-            </w:tcBorders>
-            <w:vAlign w:val="center"/>
-          </w:tcPr>
-          <w:p>
-            <w:pPr>
-              <w:spacing w:before="0" w:after="0" w:line="240" w:lineRule="auto"/>
-              <w:jc w:val="left"/>
-            </w:pPr>
-            <w:r>
-              <w:rPr>
-                <w:rFonts w:ascii="Arial" w:hAnsi="Arial" w:eastAsia="Malgun Gothic" w:cs="Arial"/>
-                <w:sz w:val="24"/>
-                <w:szCs w:val="24"/>
-              </w:rPr>
-              <w:t xml:space="preserve">F11</w:t>
-            </w:r>
-          </w:p>
-        </w:tc>
-        <w:tc>
-          <w:tcPr>
-            <w:tcW w:w="2180" w:type="dxa"/>
+            <w:tcW w:w="1766" w:type="dxa"/>
+            <w:tcBorders>
+              <w:top w:val="nil"/>
+              <w:left w:val="nil"/>
+              <w:bottom w:val="nil"/>
+              <w:right w:val="nil"/>
+            </w:tcBorders>
+            <w:vAlign w:val="center"/>
+          </w:tcPr>
+          <w:p>
+            <w:pPr>
+              <w:spacing w:before="0" w:after="0" w:line="240" w:lineRule="auto"/>
+              <w:jc w:val="left"/>
+            </w:pPr>
+            <w:r>
+              <w:rPr>
+                <w:rFonts w:ascii="Arial" w:hAnsi="Arial" w:eastAsia="Malgun Gothic" w:cs="Arial"/>
+                <w:sz w:val="24"/>
+                <w:szCs w:val="24"/>
+              </w:rPr>
+              <w:t xml:space="preserve">F1</w:t>
+            </w:r>
+          </w:p>
+        </w:tc>
+        <w:tc>
+          <w:tcPr>
+            <w:tcW w:w="2177" w:type="dxa"/>
             <w:tcBorders>
               <w:top w:val="nil"/>
               <w:left w:val="nil"/>
@@ -1044,33 +1044,33 @@
         </w:tc>
         <w:tc>
           <w:tcPr>
-            <w:tcW w:w="1763" w:type="dxa"/>
-            <w:tcBorders>
-              <w:top w:val="nil"/>
-              <w:left w:val="nil"/>
-              <w:bottom w:val="nil"/>
-              <w:right w:val="nil"/>
-            </w:tcBorders>
-            <w:vAlign w:val="center"/>
-          </w:tcPr>
-          <w:p>
-            <w:pPr>
-              <w:spacing w:before="0" w:after="0" w:line="240" w:lineRule="auto"/>
-              <w:jc w:val="left"/>
-            </w:pPr>
-            <w:r>
-              <w:rPr>
-                <w:rFonts w:ascii="Arial" w:hAnsi="Arial" w:eastAsia="Malgun Gothic" w:cs="Arial"/>
-                <w:sz w:val="24"/>
-                <w:szCs w:val="24"/>
-              </w:rPr>
-              <w:t xml:space="preserve">TH1- TH4</w:t>
-            </w:r>
-          </w:p>
-        </w:tc>
-        <w:tc>
-          <w:tcPr>
-            <w:tcW w:w="2180" w:type="dxa"/>
+            <w:tcW w:w="1766" w:type="dxa"/>
+            <w:tcBorders>
+              <w:top w:val="nil"/>
+              <w:left w:val="nil"/>
+              <w:bottom w:val="nil"/>
+              <w:right w:val="nil"/>
+            </w:tcBorders>
+            <w:vAlign w:val="center"/>
+          </w:tcPr>
+          <w:p>
+            <w:pPr>
+              <w:spacing w:before="0" w:after="0" w:line="240" w:lineRule="auto"/>
+              <w:jc w:val="left"/>
+            </w:pPr>
+            <w:r>
+              <w:rPr>
+                <w:rFonts w:ascii="Arial" w:hAnsi="Arial" w:eastAsia="Malgun Gothic" w:cs="Arial"/>
+                <w:sz w:val="24"/>
+                <w:szCs w:val="24"/>
+              </w:rPr>
+              <w:t xml:space="preserve">TH1 - TH4</w:t>
+            </w:r>
+          </w:p>
+        </w:tc>
+        <w:tc>
+          <w:tcPr>
+            <w:tcW w:w="2177" w:type="dxa"/>
             <w:tcBorders>
               <w:top w:val="nil"/>
               <w:left w:val="nil"/>
@@ -1218,7 +1218,7 @@
           <w:ilvl w:val="0"/>
           <w:numId w:val="1"/>
         </w:numPr>
-        <w:spacing w:before="14" w:after="0" w:line="240" w:lineRule="atLeast"/>
+        <w:spacing w:before="2" w:after="0" w:line="240" w:lineRule="atLeast"/>
         <w:ind w:left="1739" w:hanging="346"/>
       </w:pPr>
       <w:r>
@@ -1236,7 +1236,7 @@
           <w:ilvl w:val="0"/>
           <w:numId w:val="1"/>
         </w:numPr>
-        <w:spacing w:before="42" w:after="0" w:line="252" w:lineRule="atLeast"/>
+        <w:spacing w:before="53" w:after="0" w:line="252" w:lineRule="atLeast"/>
         <w:ind w:left="1745" w:hanging="346"/>
       </w:pPr>
       <w:r>
@@ -1262,8 +1262,8 @@
     </w:p>
     <w:p>
       <w:pPr>
-        <w:spacing w:before="1132" w:after="0" w:line="153" w:lineRule="exact"/>
-        <w:ind w:left="1088"/>
+        <w:spacing w:before="1144" w:after="0" w:line="153" w:lineRule="exact"/>
+        <w:ind w:left="1065"/>
       </w:pPr>
       <w:r>
         <w:rPr>
@@ -1272,7 +1272,7 @@
           <w:sz w:val="13"/>
           <w:szCs w:val="13"/>
         </w:rPr>
-        <w:t xml:space="preserve">Prices do not include GST, may change without notice and are subject to availability. Sulte sizes may vary on final Strata Plan. Concert reserves the right to</w:t>
+        <w:t xml:space="preserve">rices do not include GST, may change without notice and are subject to availability. Sulte sizes may vary on final Strata Plan. Concert reserves the right t</w:t>
       </w:r>
       <w:r>
         <w:t xml:space="preserve"> </w:t>
@@ -1284,12 +1284,12 @@
           <w:sz w:val="12"/>
           <w:szCs w:val="12"/>
         </w:rPr>
-        <w:t xml:space="preserve">make modifications and changes to floorplans, project design, specifications and features. October 2021. CONCERT REALTY SERVICES LTD. E. &amp;O.E.</w:t>
-      </w:r>
-    </w:p>
-    <w:p>
-      <w:pPr>
-        <w:spacing w:before="1077" w:after="0" w:line="196" w:lineRule="exact"/>
+        <w:t xml:space="preserve">make modifications and changes to floorplans, project design, specifications and features. October 2021. CONCERT REALTY SERVICES LTD. E.&amp;O.E.</w:t>
+      </w:r>
+    </w:p>
+    <w:p>
+      <w:pPr>
+        <w:spacing w:before="1060" w:after="0" w:line="207" w:lineRule="exact"/>
         <w:ind w:left="1047"/>
       </w:pPr>
       <w:r>
@@ -1321,7 +1321,7 @@
         <w:tabs>
           <w:tab w:val="right" w:pos="10113"/>
         </w:tabs>
-        <w:spacing w:before="25" w:after="0" w:line="192" w:lineRule="atLeast"/>
+        <w:spacing w:before="8" w:after="0" w:line="192" w:lineRule="atLeast"/>
         <w:ind w:left="1035"/>
       </w:pPr>
       <w:r>

</xml_diff>

<commit_message>
Update Office layout verification outputs from the latest test run
Co-Authored-By: Claude Opus 5.5 <noreply@anthropic.com>
Claude-Session: https://claude.ai/code/session_01N2KPqXq9Whv7eR2vrvkBWC
</commit_message>
<xml_diff>
--- a/ios/Verification/office-layout/OfficeSamplePhoto.docx
+++ b/ios/Verification/office-layout/OfficeSamplePhoto.docx
@@ -147,13 +147,13 @@
     </w:p>
     <w:p>
       <w:pPr>
-        <w:spacing w:before="808" w:after="0" w:line="660" w:lineRule="atLeast"/>
-        <w:ind w:left="1029"/>
-      </w:pPr>
-      <w:r>
-        <w:rPr>
-          <w:rFonts w:ascii="Arial" w:hAnsi="Arial" w:eastAsia="Malgun Gothic" w:cs="Arial"/>
-          <w:spacing w:val="31"/>
+        <w:spacing w:before="727" w:after="0" w:line="660" w:lineRule="exact"/>
+        <w:ind w:left="1029" w:right="-1430"/>
+      </w:pPr>
+      <w:r>
+        <w:rPr>
+          <w:rFonts w:ascii="Arial" w:hAnsi="Arial" w:eastAsia="Malgun Gothic" w:cs="Arial"/>
+          <w:spacing w:val="24"/>
           <w:sz w:val="55"/>
           <w:szCs w:val="55"/>
         </w:rPr>
@@ -162,13 +162,13 @@
     </w:p>
     <w:p>
       <w:pPr>
-        <w:spacing w:before="0" w:after="0" w:line="216" w:lineRule="atLeast"/>
-        <w:ind w:left="1159"/>
-      </w:pPr>
-      <w:r>
-        <w:rPr>
-          <w:rFonts w:ascii="Arial" w:hAnsi="Arial" w:eastAsia="Malgun Gothic" w:cs="Arial"/>
-          <w:spacing w:val="20"/>
+        <w:spacing w:before="0" w:after="0" w:line="216" w:lineRule="exact"/>
+        <w:ind w:left="1159" w:right="-1430"/>
+      </w:pPr>
+      <w:r>
+        <w:rPr>
+          <w:rFonts w:ascii="Arial" w:hAnsi="Arial" w:eastAsia="Malgun Gothic" w:cs="Arial"/>
+          <w:spacing w:val="18"/>
           <w:sz w:val="18"/>
           <w:szCs w:val="18"/>
         </w:rPr>
@@ -177,7 +177,7 @@
     </w:p>
     <w:p>
       <w:pPr>
-        <w:spacing w:before="1341" w:after="0" w:line="348" w:lineRule="atLeast"/>
+        <w:spacing w:before="1207" w:after="0" w:line="348" w:lineRule="exact"/>
         <w:ind w:left="1009"/>
         <w:jc w:val="center"/>
       </w:pPr>
@@ -186,7 +186,7 @@
           <w:rFonts w:ascii="Arial" w:hAnsi="Arial" w:eastAsia="Malgun Gothic" w:cs="Arial"/>
           <w:b/>
           <w:bCs/>
-          <w:spacing w:val="-6"/>
+          <w:spacing w:val="-8"/>
           <w:sz w:val="29"/>
           <w:szCs w:val="29"/>
         </w:rPr>
@@ -195,7 +195,7 @@
     </w:p>
     <w:p>
       <w:pPr>
-        <w:spacing w:before="166" w:after="0" w:line="240" w:lineRule="atLeast"/>
+        <w:spacing w:before="150" w:after="0" w:line="240" w:lineRule="exact"/>
         <w:ind w:left="980"/>
         <w:jc w:val="center"/>
       </w:pPr>
@@ -210,7 +210,7 @@
     </w:p>
     <w:p>
       <w:pPr>
-        <w:spacing w:before="0" w:after="0" w:line="686" w:lineRule="exact"/>
+        <w:spacing w:before="0" w:after="0" w:line="617" w:lineRule="exact"/>
         <w:rPr>
           <w:sz w:val="2"/>
         </w:rPr>
@@ -1124,13 +1124,13 @@
     </w:tbl>
     <w:p>
       <w:pPr>
-        <w:spacing w:before="720" w:after="0" w:line="240" w:lineRule="atLeast"/>
-        <w:ind w:left="1065"/>
-      </w:pPr>
-      <w:r>
-        <w:rPr>
-          <w:rFonts w:ascii="Arial" w:hAnsi="Arial" w:eastAsia="Malgun Gothic" w:cs="Arial"/>
-          <w:spacing w:val="8"/>
+        <w:spacing w:before="648" w:after="0" w:line="240" w:lineRule="exact"/>
+        <w:ind w:left="1065" w:right="-1430"/>
+      </w:pPr>
+      <w:r>
+        <w:rPr>
+          <w:rFonts w:ascii="Arial" w:hAnsi="Arial" w:eastAsia="Malgun Gothic" w:cs="Arial"/>
+          <w:spacing w:val="7"/>
           <w:sz w:val="20"/>
           <w:szCs w:val="20"/>
         </w:rPr>
@@ -1143,13 +1143,13 @@
           <w:ilvl w:val="0"/>
           <w:numId w:val="1"/>
         </w:numPr>
-        <w:spacing w:before="202" w:after="0" w:line="252" w:lineRule="atLeast"/>
-        <w:ind w:left="1757" w:hanging="358"/>
-      </w:pPr>
-      <w:r>
-        <w:rPr>
-          <w:rFonts w:ascii="Arial" w:hAnsi="Arial" w:eastAsia="Malgun Gothic" w:cs="Arial"/>
-          <w:spacing w:val="4"/>
+        <w:spacing w:before="182" w:after="0" w:line="252" w:lineRule="exact"/>
+        <w:ind w:left="1757" w:right="-1430" w:hanging="358"/>
+      </w:pPr>
+      <w:r>
+        <w:rPr>
+          <w:rFonts w:ascii="Arial" w:hAnsi="Arial" w:eastAsia="Malgun Gothic" w:cs="Arial"/>
+          <w:spacing w:val="2"/>
           <w:sz w:val="21"/>
           <w:szCs w:val="21"/>
         </w:rPr>
@@ -1162,13 +1162,13 @@
           <w:ilvl w:val="0"/>
           <w:numId w:val="1"/>
         </w:numPr>
-        <w:spacing w:before="30" w:after="0" w:line="240" w:lineRule="atLeast"/>
-        <w:ind w:left="1745" w:hanging="346"/>
-      </w:pPr>
-      <w:r>
-        <w:rPr>
-          <w:rFonts w:ascii="Arial" w:hAnsi="Arial" w:eastAsia="Malgun Gothic" w:cs="Arial"/>
-          <w:spacing w:val="6"/>
+        <w:spacing w:before="27" w:after="0" w:line="240" w:lineRule="exact"/>
+        <w:ind w:left="1745" w:right="-1430" w:hanging="346"/>
+      </w:pPr>
+      <w:r>
+        <w:rPr>
+          <w:rFonts w:ascii="Arial" w:hAnsi="Arial" w:eastAsia="Malgun Gothic" w:cs="Arial"/>
+          <w:spacing w:val="5"/>
           <w:sz w:val="20"/>
           <w:szCs w:val="20"/>
         </w:rPr>
@@ -1181,13 +1181,13 @@
           <w:ilvl w:val="0"/>
           <w:numId w:val="1"/>
         </w:numPr>
-        <w:spacing w:before="31" w:after="0" w:line="228" w:lineRule="atLeast"/>
-        <w:ind w:left="1739" w:hanging="340"/>
-      </w:pPr>
-      <w:r>
-        <w:rPr>
-          <w:rFonts w:ascii="Arial" w:hAnsi="Arial" w:eastAsia="Malgun Gothic" w:cs="Arial"/>
-          <w:spacing w:val="4"/>
+        <w:spacing w:before="28" w:after="0" w:line="228" w:lineRule="exact"/>
+        <w:ind w:left="1739" w:right="-1430" w:hanging="340"/>
+      </w:pPr>
+      <w:r>
+        <w:rPr>
+          <w:rFonts w:ascii="Arial" w:hAnsi="Arial" w:eastAsia="Malgun Gothic" w:cs="Arial"/>
+          <w:spacing w:val="2"/>
           <w:sz w:val="19"/>
           <w:szCs w:val="19"/>
         </w:rPr>
@@ -1200,12 +1200,13 @@
           <w:ilvl w:val="0"/>
           <w:numId w:val="1"/>
         </w:numPr>
-        <w:spacing w:before="31" w:after="0" w:line="240" w:lineRule="atLeast"/>
-        <w:ind w:left="1739" w:hanging="346"/>
-      </w:pPr>
-      <w:r>
-        <w:rPr>
-          <w:rFonts w:ascii="Arial" w:hAnsi="Arial" w:eastAsia="Malgun Gothic" w:cs="Arial"/>
+        <w:spacing w:before="28" w:after="0" w:line="240" w:lineRule="exact"/>
+        <w:ind w:left="1739" w:right="-1430" w:hanging="346"/>
+      </w:pPr>
+      <w:r>
+        <w:rPr>
+          <w:rFonts w:ascii="Arial" w:hAnsi="Arial" w:eastAsia="Malgun Gothic" w:cs="Arial"/>
+          <w:spacing w:val="-2"/>
           <w:sz w:val="20"/>
           <w:szCs w:val="20"/>
         </w:rPr>
@@ -1218,8 +1219,8 @@
           <w:ilvl w:val="0"/>
           <w:numId w:val="1"/>
         </w:numPr>
-        <w:spacing w:before="2" w:after="0" w:line="240" w:lineRule="atLeast"/>
-        <w:ind w:left="1739" w:hanging="346"/>
+        <w:spacing w:before="2" w:after="0" w:line="240" w:lineRule="exact"/>
+        <w:ind w:left="1739" w:right="-1430" w:hanging="346"/>
       </w:pPr>
       <w:r>
         <w:rPr>
@@ -1236,13 +1237,13 @@
           <w:ilvl w:val="0"/>
           <w:numId w:val="1"/>
         </w:numPr>
-        <w:spacing w:before="53" w:after="0" w:line="252" w:lineRule="atLeast"/>
-        <w:ind w:left="1745" w:hanging="346"/>
-      </w:pPr>
-      <w:r>
-        <w:rPr>
-          <w:rFonts w:ascii="Arial" w:hAnsi="Arial" w:eastAsia="Malgun Gothic" w:cs="Arial"/>
-          <w:spacing w:val="4"/>
+        <w:spacing w:before="48" w:after="0" w:line="252" w:lineRule="exact"/>
+        <w:ind w:left="1745" w:right="-1430" w:hanging="346"/>
+      </w:pPr>
+      <w:r>
+        <w:rPr>
+          <w:rFonts w:ascii="Arial" w:hAnsi="Arial" w:eastAsia="Malgun Gothic" w:cs="Arial"/>
+          <w:spacing w:val="2"/>
           <w:sz w:val="21"/>
           <w:szCs w:val="21"/>
         </w:rPr>
@@ -1253,7 +1254,7 @@
           <w:rFonts w:ascii="Arial" w:hAnsi="Arial" w:eastAsia="Malgun Gothic" w:cs="Arial"/>
           <w:b/>
           <w:bCs/>
-          <w:spacing w:val="4"/>
+          <w:spacing w:val="2"/>
           <w:sz w:val="21"/>
           <w:szCs w:val="21"/>
         </w:rPr>
@@ -1262,25 +1263,25 @@
     </w:p>
     <w:p>
       <w:pPr>
-        <w:spacing w:before="1144" w:after="0" w:line="153" w:lineRule="exact"/>
-        <w:ind w:left="1065"/>
-      </w:pPr>
-      <w:r>
-        <w:rPr>
-          <w:rFonts w:ascii="Arial" w:hAnsi="Arial" w:eastAsia="Malgun Gothic" w:cs="Arial"/>
-          <w:spacing w:val="2"/>
+        <w:spacing w:before="1029" w:after="0" w:line="153" w:lineRule="exact"/>
+        <w:ind w:left="1065" w:right="-1430"/>
+      </w:pPr>
+      <w:r>
+        <w:rPr>
+          <w:rFonts w:ascii="Arial" w:hAnsi="Arial" w:eastAsia="Malgun Gothic" w:cs="Arial"/>
+          <w:spacing w:val="-1"/>
           <w:sz w:val="13"/>
           <w:szCs w:val="13"/>
         </w:rPr>
         <w:t xml:space="preserve">rices do not include GST, may change without notice and are subject to availability. Sulte sizes may vary on final Strata Plan. Concert reserves the right t</w:t>
       </w:r>
       <w:r>
-        <w:t xml:space="preserve"> </w:t>
-      </w:r>
-      <w:r>
-        <w:rPr>
-          <w:rFonts w:ascii="Arial" w:hAnsi="Arial" w:eastAsia="Malgun Gothic" w:cs="Arial"/>
-          <w:spacing w:val="2"/>
+        <w:br/>
+      </w:r>
+      <w:r>
+        <w:rPr>
+          <w:rFonts w:ascii="Arial" w:hAnsi="Arial" w:eastAsia="Malgun Gothic" w:cs="Arial"/>
+          <w:spacing w:val="-1"/>
           <w:sz w:val="12"/>
           <w:szCs w:val="12"/>
         </w:rPr>
@@ -1289,15 +1290,15 @@
     </w:p>
     <w:p>
       <w:pPr>
-        <w:spacing w:before="1060" w:after="0" w:line="207" w:lineRule="exact"/>
-        <w:ind w:left="1047"/>
+        <w:spacing w:before="954" w:after="0" w:line="207" w:lineRule="exact"/>
+        <w:ind w:left="1047" w:right="-1430"/>
       </w:pPr>
       <w:r>
         <w:rPr>
           <w:rFonts w:ascii="Arial" w:hAnsi="Arial" w:eastAsia="Malgun Gothic" w:cs="Arial"/>
           <w:b/>
           <w:bCs/>
-          <w:spacing w:val="7"/>
+          <w:spacing w:val="-5"/>
           <w:sz w:val="14"/>
           <w:szCs w:val="14"/>
         </w:rPr>
@@ -1309,7 +1310,7 @@
       <w:r>
         <w:rPr>
           <w:rFonts w:ascii="Arial" w:hAnsi="Arial" w:eastAsia="Malgun Gothic" w:cs="Arial"/>
-          <w:spacing w:val="7"/>
+          <w:spacing w:val="-5"/>
           <w:sz w:val="15"/>
           <w:szCs w:val="15"/>
         </w:rPr>
@@ -1321,12 +1322,13 @@
         <w:tabs>
           <w:tab w:val="right" w:pos="10113"/>
         </w:tabs>
-        <w:spacing w:before="8" w:after="0" w:line="192" w:lineRule="atLeast"/>
-        <w:ind w:left="1035"/>
-      </w:pPr>
-      <w:r>
-        <w:rPr>
-          <w:rFonts w:ascii="Arial" w:hAnsi="Arial" w:eastAsia="Malgun Gothic" w:cs="Arial"/>
+        <w:spacing w:before="7" w:after="0" w:line="192" w:lineRule="exact"/>
+        <w:ind w:left="1035" w:right="-1430"/>
+      </w:pPr>
+      <w:r>
+        <w:rPr>
+          <w:rFonts w:ascii="Arial" w:hAnsi="Arial" w:eastAsia="Malgun Gothic" w:cs="Arial"/>
+          <w:spacing w:val="-5"/>
           <w:sz w:val="16"/>
           <w:szCs w:val="16"/>
         </w:rPr>
@@ -1338,6 +1340,7 @@
       <w:r>
         <w:rPr>
           <w:rFonts w:ascii="Arial" w:hAnsi="Arial" w:eastAsia="Malgun Gothic" w:cs="Arial"/>
+          <w:spacing w:val="-5"/>
           <w:sz w:val="28"/>
           <w:szCs w:val="28"/>
         </w:rPr>
@@ -1354,7 +1357,7 @@
     </w:p>
     <w:sectPr>
       <w:pgSz w:w="12240" w:h="15840"/>
-      <w:pgMar w:top="362" w:right="1470" w:bottom="360" w:left="637" w:header="0" w:footer="0" w:gutter="0"/>
+      <w:pgMar w:top="362" w:right="1470" w:bottom="200" w:left="637" w:header="0" w:footer="0" w:gutter="0"/>
     </w:sectPr>
   </w:body>
 </w:document>

</xml_diff>

<commit_message>
Convert & read fixes from corpus testing; paywall colours; rename to FoldScan
- Office: keep recognized lines together (CJK interleaving), two-column pages
  as Word columns, outline-only tables rebuilt from aligned columns, wrapped
  row labels, spaces between columns, no tables from column prose, XML-safe
  text, sideways pages turned upright, small images enlarged, bold calibrated
  (incl. CJK, local light).
- Math: tolerant solver for photographed sheets (numbering, =, superscripts,
  √, x/÷), never merges "2 57" into 257.
- Photo translation: clamp edge boxes, light text on dark/colored signs.
- ConvertCorpusTests harness (private corpus, skipped when absent).
- Paywall: each slide its own stage colour. Extract text glyph square.
- App name FoldScan.

Co-Authored-By: Claude Opus 5.5 <noreply@anthropic.com>
Claude-Session: https://claude.ai/code/session_01N2KPqXq9Whv7eR2vrvkBWC
</commit_message>
<xml_diff>
--- a/ios/Verification/office-layout/OfficeSamplePhoto.docx
+++ b/ios/Verification/office-layout/OfficeSamplePhoto.docx
@@ -202,6 +202,9 @@
       <w:r>
         <w:rPr>
           <w:rFonts w:ascii="Arial" w:hAnsi="Arial" w:eastAsia="Malgun Gothic" w:cs="Arial"/>
+          <w:b/>
+          <w:bCs/>
+          <w:spacing w:val="-7"/>
           <w:sz w:val="20"/>
           <w:szCs w:val="20"/>
         </w:rPr>
@@ -407,6 +410,8 @@
             <w:r>
               <w:rPr>
                 <w:rFonts w:ascii="Arial" w:hAnsi="Arial" w:eastAsia="Malgun Gothic" w:cs="Arial"/>
+                <w:b/>
+                <w:bCs/>
                 <w:sz w:val="24"/>
                 <w:szCs w:val="24"/>
               </w:rPr>
@@ -436,7 +441,7 @@
                 <w:sz w:val="24"/>
                 <w:szCs w:val="24"/>
               </w:rPr>
-              <w:t xml:space="preserve">476 - 479</w:t>
+              <w:t xml:space="preserve">476-479</w:t>
             </w:r>
           </w:p>
         </w:tc>
@@ -540,7 +545,17 @@
                 <w:sz w:val="24"/>
                 <w:szCs w:val="24"/>
               </w:rPr>
-              <w:t xml:space="preserve">518 - 689</w:t>
+              <w:t xml:space="preserve">518 -</w:t>
+            </w:r>
+            <w:r>
+              <w:rPr>
+                <w:rFonts w:ascii="Arial" w:hAnsi="Arial" w:eastAsia="Malgun Gothic" w:cs="Arial"/>
+                <w:b/>
+                <w:bCs/>
+                <w:sz w:val="24"/>
+                <w:szCs w:val="24"/>
+              </w:rPr>
+              <w:t xml:space="preserve"> 689</w:t>
             </w:r>
           </w:p>
         </w:tc>
@@ -650,7 +665,7 @@
                 <w:sz w:val="24"/>
                 <w:szCs w:val="24"/>
               </w:rPr>
-              <w:t xml:space="preserve">644 - 769</w:t>
+              <w:t xml:space="preserve">644-769</w:t>
             </w:r>
           </w:p>
         </w:tc>
@@ -760,7 +775,7 @@
                 <w:sz w:val="24"/>
                 <w:szCs w:val="24"/>
               </w:rPr>
-              <w:t xml:space="preserve">801 - 989</w:t>
+              <w:t xml:space="preserve">801-989</w:t>
             </w:r>
           </w:p>
         </w:tc>
@@ -870,7 +885,7 @@
                 <w:sz w:val="24"/>
                 <w:szCs w:val="24"/>
               </w:rPr>
-              <w:t xml:space="preserve">834 - 1,062</w:t>
+              <w:t xml:space="preserve">834-1,062</w:t>
             </w:r>
           </w:p>
         </w:tc>
@@ -1090,7 +1105,7 @@
                 <w:sz w:val="24"/>
                 <w:szCs w:val="24"/>
               </w:rPr>
-              <w:t xml:space="preserve">1,338 - 1,553</w:t>
+              <w:t xml:space="preserve">1,338-1,553</w:t>
             </w:r>
           </w:p>
         </w:tc>
@@ -1328,7 +1343,7 @@
       <w:r>
         <w:rPr>
           <w:rFonts w:ascii="Arial" w:hAnsi="Arial" w:eastAsia="Malgun Gothic" w:cs="Arial"/>
-          <w:spacing w:val="-5"/>
+          <w:spacing w:val="-12"/>
           <w:sz w:val="16"/>
           <w:szCs w:val="16"/>
         </w:rPr>
@@ -1340,7 +1355,9 @@
       <w:r>
         <w:rPr>
           <w:rFonts w:ascii="Arial" w:hAnsi="Arial" w:eastAsia="Malgun Gothic" w:cs="Arial"/>
-          <w:spacing w:val="-5"/>
+          <w:b/>
+          <w:bCs/>
+          <w:spacing w:val="-12"/>
           <w:sz w:val="28"/>
           <w:szCs w:val="28"/>
         </w:rPr>

</xml_diff>

<commit_message>
Page frame and heading bars in Office export, receipt fixes, UVDoc benchmark, flatten by surface length
- Page-wide frame becomes a Word page border; dark and gray heading bars become paragraph shading
- Fix out-of-range read in Ink.fill (crash on pages with text near the edge)
- Pictures made mostly of recognized words keep only the unread ink (no doubled receipt totals)
- One-line paragraphs no taller than the room to the next line; short words capped by width
- Accept confident document segmentation on heavily printed pages; prefer the sheet over a printed rectangle inside it
- Snap aspect to the nearest paper size; lay out the flattened page by surface arc length
- UVDoc benchmark test and scorer support

Co-Authored-By: Claude Opus 5.5 <noreply@anthropic.com>
Claude-Session: https://claude.ai/code/session_01N2KPqXq9Whv7eR2vrvkBWC
</commit_message>
<xml_diff>
--- a/ios/Verification/office-layout/OfficeSamplePhoto.docx
+++ b/ios/Verification/office-layout/OfficeSamplePhoto.docx
@@ -153,9 +153,9 @@
       <w:r>
         <w:rPr>
           <w:rFonts w:ascii="Arial" w:hAnsi="Arial" w:eastAsia="Malgun Gothic" w:cs="Arial"/>
-          <w:spacing w:val="24"/>
-          <w:sz w:val="55"/>
-          <w:szCs w:val="55"/>
+          <w:spacing w:val="31"/>
+          <w:sz w:val="43"/>
+          <w:szCs w:val="43"/>
         </w:rPr>
         <w:t xml:space="preserve">MYRIAD</w:t>
       </w:r>

</xml_diff>

<commit_message>
Sharper scans: 48 MP capture in good light, supersampled clarity step
- Camera: good light captures at the sensor's full 48 MP and decodes
  straight to ~24 MP with ImageIO (orientation applied); dim light keeps
  the ~12 MP three-frame burst.
- Clarity: pages with a long side under 3600 px run the stroke step at
  up to 2x and scale back, so letter edges stay antialiased instead of
  snapping to whole pixels. Page size and coordinates are unchanged.
- Ink ramp (0.18, 0.55) -> (0.14, 0.65); 0.12-0.8 loses thin printed
  checkboxes on the Notice sample.
- Sharpness test reads the phone scan with its saved crop.

Co-Authored-By: Claude Opus 5.5 <noreply@anthropic.com>
Claude-Session: https://claude.ai/code/session_01N2KPqXq9Whv7eR2vrvkBWC
</commit_message>
<xml_diff>
--- a/ios/Verification/office-layout/OfficeSamplePhoto.docx
+++ b/ios/Verification/office-layout/OfficeSamplePhoto.docx
@@ -19,7 +19,7 @@
             <wp:positionV relativeFrom="page">
               <wp:posOffset>268271</wp:posOffset>
             </wp:positionV>
-            <wp:extent cx="491830" cy="59616"/>
+            <wp:extent cx="476926" cy="59616"/>
             <wp:effectExtent l="0" t="0" r="0" b="0"/>
             <wp:wrapNone/>
             <wp:docPr id="1" name="Picture 1"/>
@@ -42,7 +42,7 @@
                   <pic:spPr>
                     <a:xfrm>
                       <a:off x="0" y="0"/>
-                      <a:ext cx="491830" cy="59616"/>
+                      <a:ext cx="476926" cy="59616"/>
                     </a:xfrm>
                     <a:prstGeom prst="rect">
                       <a:avLst/>
@@ -99,61 +99,16 @@
           </wp:anchor>
         </w:drawing>
       </w:r>
-      <w:r>
-        <w:drawing>
-          <wp:anchor distT="0" distB="0" distL="0" distR="0" simplePos="0" relativeHeight="3" behindDoc="1" locked="0" layoutInCell="1" allowOverlap="1">
-            <wp:simplePos x="0" y="0"/>
-            <wp:positionH relativeFrom="page">
-              <wp:posOffset>1550009</wp:posOffset>
-            </wp:positionH>
-            <wp:positionV relativeFrom="page">
-              <wp:posOffset>1386066</wp:posOffset>
-            </wp:positionV>
-            <wp:extent cx="789908" cy="44712"/>
-            <wp:effectExtent l="0" t="0" r="0" b="0"/>
-            <wp:wrapNone/>
-            <wp:docPr id="3" name="Picture 3"/>
-            <wp:cNvGraphicFramePr>
-              <a:graphicFrameLocks noChangeAspect="1"/>
-            </wp:cNvGraphicFramePr>
-            <a:graphic>
-              <a:graphicData uri="http://schemas.openxmlformats.org/drawingml/2006/picture">
-                <pic:pic>
-                  <pic:nvPicPr>
-                    <pic:cNvPr id="3" name="Picture 3"/>
-                    <pic:cNvPicPr/>
-                  </pic:nvPicPr>
-                  <pic:blipFill>
-                    <a:blip r:embed="rId5"/>
-                    <a:stretch>
-                      <a:fillRect/>
-                    </a:stretch>
-                  </pic:blipFill>
-                  <pic:spPr>
-                    <a:xfrm>
-                      <a:off x="0" y="0"/>
-                      <a:ext cx="789908" cy="44712"/>
-                    </a:xfrm>
-                    <a:prstGeom prst="rect">
-                      <a:avLst/>
-                    </a:prstGeom>
-                  </pic:spPr>
-                </pic:pic>
-              </a:graphicData>
-            </a:graphic>
-          </wp:anchor>
-        </w:drawing>
-      </w:r>
     </w:p>
     <w:p>
       <w:pPr>
         <w:spacing w:before="727" w:after="0" w:line="660" w:lineRule="exact"/>
-        <w:ind w:left="1029" w:right="-1430"/>
-      </w:pPr>
-      <w:r>
-        <w:rPr>
-          <w:rFonts w:ascii="Arial" w:hAnsi="Arial" w:eastAsia="Malgun Gothic" w:cs="Arial"/>
-          <w:spacing w:val="31"/>
+        <w:ind w:left="988" w:right="-1430"/>
+      </w:pPr>
+      <w:r>
+        <w:rPr>
+          <w:rFonts w:ascii="Arial" w:hAnsi="Arial" w:eastAsia="Malgun Gothic" w:cs="Arial"/>
+          <w:spacing w:val="39"/>
           <w:sz w:val="43"/>
           <w:szCs w:val="43"/>
         </w:rPr>
@@ -162,23 +117,23 @@
     </w:p>
     <w:p>
       <w:pPr>
-        <w:spacing w:before="0" w:after="0" w:line="216" w:lineRule="exact"/>
-        <w:ind w:left="1159" w:right="-1430"/>
-      </w:pPr>
-      <w:r>
-        <w:rPr>
-          <w:rFonts w:ascii="Arial" w:hAnsi="Arial" w:eastAsia="Malgun Gothic" w:cs="Arial"/>
-          <w:spacing w:val="18"/>
-          <w:sz w:val="18"/>
-          <w:szCs w:val="18"/>
+        <w:spacing w:before="0" w:after="0" w:line="180" w:lineRule="exact"/>
+        <w:ind w:left="1164" w:right="-1430"/>
+      </w:pPr>
+      <w:r>
+        <w:rPr>
+          <w:rFonts w:ascii="Arial" w:hAnsi="Arial" w:eastAsia="Malgun Gothic" w:cs="Arial"/>
+          <w:spacing w:val="37"/>
+          <w:sz w:val="15"/>
+          <w:szCs w:val="15"/>
         </w:rPr>
         <w:t xml:space="preserve">HEART OF BURQUITLAM</w:t>
       </w:r>
     </w:p>
     <w:p>
       <w:pPr>
-        <w:spacing w:before="1207" w:after="0" w:line="348" w:lineRule="exact"/>
-        <w:ind w:left="1009"/>
+        <w:spacing w:before="1223" w:after="0" w:line="348" w:lineRule="exact"/>
+        <w:ind w:left="1003"/>
         <w:jc w:val="center"/>
       </w:pPr>
       <w:r>
@@ -186,7 +141,7 @@
           <w:rFonts w:ascii="Arial" w:hAnsi="Arial" w:eastAsia="Malgun Gothic" w:cs="Arial"/>
           <w:b/>
           <w:bCs/>
-          <w:spacing w:val="-8"/>
+          <w:spacing w:val="-9"/>
           <w:sz w:val="29"/>
           <w:szCs w:val="29"/>
         </w:rPr>
@@ -208,12 +163,21 @@
           <w:sz w:val="20"/>
           <w:szCs w:val="20"/>
         </w:rPr>
-        <w:t xml:space="preserve">October 2021</w:t>
-      </w:r>
-    </w:p>
-    <w:p>
-      <w:pPr>
-        <w:spacing w:before="0" w:after="0" w:line="617" w:lineRule="exact"/>
+        <w:t xml:space="preserve">October</w:t>
+      </w:r>
+      <w:r>
+        <w:rPr>
+          <w:rFonts w:ascii="Arial" w:hAnsi="Arial" w:eastAsia="Malgun Gothic" w:cs="Arial"/>
+          <w:spacing w:val="-7"/>
+          <w:sz w:val="20"/>
+          <w:szCs w:val="20"/>
+        </w:rPr>
+        <w:t xml:space="preserve"> 2021</w:t>
+      </w:r>
+    </w:p>
+    <w:p>
+      <w:pPr>
+        <w:spacing w:before="0" w:after="0" w:line="626" w:lineRule="exact"/>
         <w:rPr>
           <w:sz w:val="2"/>
         </w:rPr>
@@ -242,13 +206,13 @@
       </w:tblPr>
       <w:tblGrid>
         <w:gridCol w:w="2764"/>
-        <w:gridCol w:w="1766"/>
-        <w:gridCol w:w="2177"/>
+        <w:gridCol w:w="1763"/>
+        <w:gridCol w:w="2180"/>
         <w:gridCol w:w="2095"/>
       </w:tblGrid>
       <w:tr>
         <w:trPr>
-          <w:trHeight w:val="505" w:hRule="exact"/>
+          <w:trHeight w:val="495" w:hRule="exact"/>
           <w:cantSplit/>
         </w:trPr>
         <w:tc>
@@ -280,7 +244,7 @@
         </w:tc>
         <w:tc>
           <w:tcPr>
-            <w:tcW w:w="1766" w:type="dxa"/>
+            <w:tcW w:w="1763" w:type="dxa"/>
             <w:tcBorders>
               <w:top w:val="nil"/>
               <w:left w:val="nil"/>
@@ -307,7 +271,7 @@
         </w:tc>
         <w:tc>
           <w:tcPr>
-            <w:tcW w:w="2177" w:type="dxa"/>
+            <w:tcW w:w="2180" w:type="dxa"/>
             <w:tcBorders>
               <w:top w:val="nil"/>
               <w:left w:val="nil"/>
@@ -393,7 +357,7 @@
         </w:tc>
         <w:tc>
           <w:tcPr>
-            <w:tcW w:w="1766" w:type="dxa"/>
+            <w:tcW w:w="1763" w:type="dxa"/>
             <w:tcBorders>
               <w:top w:val="nil"/>
               <w:left w:val="nil"/>
@@ -421,7 +385,7 @@
         </w:tc>
         <w:tc>
           <w:tcPr>
-            <w:tcW w:w="2177" w:type="dxa"/>
+            <w:tcW w:w="2180" w:type="dxa"/>
             <w:tcBorders>
               <w:top w:val="nil"/>
               <w:left w:val="nil"/>
@@ -499,7 +463,7 @@
         </w:tc>
         <w:tc>
           <w:tcPr>
-            <w:tcW w:w="1766" w:type="dxa"/>
+            <w:tcW w:w="1763" w:type="dxa"/>
             <w:tcBorders>
               <w:top w:val="nil"/>
               <w:left w:val="nil"/>
@@ -525,7 +489,7 @@
         </w:tc>
         <w:tc>
           <w:tcPr>
-            <w:tcW w:w="2177" w:type="dxa"/>
+            <w:tcW w:w="2180" w:type="dxa"/>
             <w:tcBorders>
               <w:top w:val="nil"/>
               <w:left w:val="nil"/>
@@ -588,7 +552,7 @@
       </w:tr>
       <w:tr>
         <w:trPr>
-          <w:trHeight w:val="439" w:hRule="exact"/>
+          <w:trHeight w:val="440" w:hRule="exact"/>
           <w:cantSplit/>
         </w:trPr>
         <w:tc>
@@ -619,7 +583,7 @@
         </w:tc>
         <w:tc>
           <w:tcPr>
-            <w:tcW w:w="1766" w:type="dxa"/>
+            <w:tcW w:w="1763" w:type="dxa"/>
             <w:tcBorders>
               <w:top w:val="nil"/>
               <w:left w:val="nil"/>
@@ -645,7 +609,7 @@
         </w:tc>
         <w:tc>
           <w:tcPr>
-            <w:tcW w:w="2177" w:type="dxa"/>
+            <w:tcW w:w="2180" w:type="dxa"/>
             <w:tcBorders>
               <w:top w:val="nil"/>
               <w:left w:val="nil"/>
@@ -729,7 +693,7 @@
         </w:tc>
         <w:tc>
           <w:tcPr>
-            <w:tcW w:w="1766" w:type="dxa"/>
+            <w:tcW w:w="1763" w:type="dxa"/>
             <w:tcBorders>
               <w:top w:val="nil"/>
               <w:left w:val="nil"/>
@@ -755,7 +719,7 @@
         </w:tc>
         <w:tc>
           <w:tcPr>
-            <w:tcW w:w="2177" w:type="dxa"/>
+            <w:tcW w:w="2180" w:type="dxa"/>
             <w:tcBorders>
               <w:top w:val="nil"/>
               <w:left w:val="nil"/>
@@ -839,7 +803,7 @@
         </w:tc>
         <w:tc>
           <w:tcPr>
-            <w:tcW w:w="1766" w:type="dxa"/>
+            <w:tcW w:w="1763" w:type="dxa"/>
             <w:tcBorders>
               <w:top w:val="nil"/>
               <w:left w:val="nil"/>
@@ -865,7 +829,7 @@
         </w:tc>
         <w:tc>
           <w:tcPr>
-            <w:tcW w:w="2177" w:type="dxa"/>
+            <w:tcW w:w="2180" w:type="dxa"/>
             <w:tcBorders>
               <w:top w:val="nil"/>
               <w:left w:val="nil"/>
@@ -949,7 +913,7 @@
         </w:tc>
         <w:tc>
           <w:tcPr>
-            <w:tcW w:w="1766" w:type="dxa"/>
+            <w:tcW w:w="1763" w:type="dxa"/>
             <w:tcBorders>
               <w:top w:val="nil"/>
               <w:left w:val="nil"/>
@@ -975,7 +939,7 @@
         </w:tc>
         <w:tc>
           <w:tcPr>
-            <w:tcW w:w="2177" w:type="dxa"/>
+            <w:tcW w:w="2180" w:type="dxa"/>
             <w:tcBorders>
               <w:top w:val="nil"/>
               <w:left w:val="nil"/>
@@ -1059,7 +1023,7 @@
         </w:tc>
         <w:tc>
           <w:tcPr>
-            <w:tcW w:w="1766" w:type="dxa"/>
+            <w:tcW w:w="1763" w:type="dxa"/>
             <w:tcBorders>
               <w:top w:val="nil"/>
               <w:left w:val="nil"/>
@@ -1085,7 +1049,7 @@
         </w:tc>
         <w:tc>
           <w:tcPr>
-            <w:tcW w:w="2177" w:type="dxa"/>
+            <w:tcW w:w="2180" w:type="dxa"/>
             <w:tcBorders>
               <w:top w:val="nil"/>
               <w:left w:val="nil"/>
@@ -1197,7 +1161,7 @@
           <w:numId w:val="1"/>
         </w:numPr>
         <w:spacing w:before="28" w:after="0" w:line="228" w:lineRule="exact"/>
-        <w:ind w:left="1739" w:right="-1430" w:hanging="340"/>
+        <w:ind w:left="1739" w:right="-1430" w:hanging="421"/>
       </w:pPr>
       <w:r>
         <w:rPr>
@@ -1234,7 +1198,7 @@
           <w:ilvl w:val="0"/>
           <w:numId w:val="1"/>
         </w:numPr>
-        <w:spacing w:before="2" w:after="0" w:line="240" w:lineRule="exact"/>
+        <w:spacing w:before="12" w:after="0" w:line="240" w:lineRule="exact"/>
         <w:ind w:left="1739" w:right="-1430" w:hanging="346"/>
       </w:pPr>
       <w:r>
@@ -1252,7 +1216,7 @@
           <w:ilvl w:val="0"/>
           <w:numId w:val="1"/>
         </w:numPr>
-        <w:spacing w:before="48" w:after="0" w:line="252" w:lineRule="exact"/>
+        <w:spacing w:before="38" w:after="0" w:line="252" w:lineRule="exact"/>
         <w:ind w:left="1745" w:right="-1430" w:hanging="346"/>
       </w:pPr>
       <w:r>
@@ -1284,11 +1248,11 @@
       <w:r>
         <w:rPr>
           <w:rFonts w:ascii="Arial" w:hAnsi="Arial" w:eastAsia="Malgun Gothic" w:cs="Arial"/>
-          <w:spacing w:val="-1"/>
+          <w:spacing w:val="-2"/>
           <w:sz w:val="13"/>
           <w:szCs w:val="13"/>
         </w:rPr>
-        <w:t xml:space="preserve">rices do not include GST, may change without notice and are subject to availability. Sulte sizes may vary on final Strata Plan. Concert reserves the right t</w:t>
+        <w:t xml:space="preserve">Prices do not include GST, may change without notice and are subject to availability. Sulte sizes may vary on final Strata Plan. Concert reserves the right to</w:t>
       </w:r>
       <w:r>
         <w:br/>
@@ -1296,16 +1260,16 @@
       <w:r>
         <w:rPr>
           <w:rFonts w:ascii="Arial" w:hAnsi="Arial" w:eastAsia="Malgun Gothic" w:cs="Arial"/>
-          <w:spacing w:val="-1"/>
+          <w:spacing w:val="-2"/>
           <w:sz w:val="12"/>
           <w:szCs w:val="12"/>
         </w:rPr>
-        <w:t xml:space="preserve">make modifications and changes to floorplans, project design, specifications and features. October 2021. CONCERT REALTY SERVICES LTD. E.&amp;O.E.</w:t>
-      </w:r>
-    </w:p>
-    <w:p>
-      <w:pPr>
-        <w:spacing w:before="954" w:after="0" w:line="207" w:lineRule="exact"/>
+        <w:t xml:space="preserve">nake modifications and changes to floorplans, project design, specifications and features. October 2021. CONCERT REALTY SERVICES LTD. E.8O.!</w:t>
+      </w:r>
+    </w:p>
+    <w:p>
+      <w:pPr>
+        <w:spacing w:before="959" w:after="0" w:line="196" w:lineRule="exact"/>
         <w:ind w:left="1047" w:right="-1430"/>
       </w:pPr>
       <w:r>
@@ -1337,15 +1301,15 @@
         <w:tabs>
           <w:tab w:val="right" w:pos="10113"/>
         </w:tabs>
-        <w:spacing w:before="7" w:after="0" w:line="192" w:lineRule="exact"/>
-        <w:ind w:left="1035" w:right="-1430"/>
+        <w:spacing w:before="28" w:after="0" w:line="180" w:lineRule="exact"/>
+        <w:ind w:left="1041" w:right="-1430"/>
       </w:pPr>
       <w:r>
         <w:rPr>
           <w:rFonts w:ascii="Arial" w:hAnsi="Arial" w:eastAsia="Malgun Gothic" w:cs="Arial"/>
           <w:spacing w:val="-12"/>
-          <w:sz w:val="16"/>
-          <w:szCs w:val="16"/>
+          <w:sz w:val="15"/>
+          <w:szCs w:val="15"/>
         </w:rPr>
         <w:t xml:space="preserve">604.335.0696 | Admin.Myriad@ConcertProperties.com</w:t>
       </w:r>

</xml_diff>

<commit_message>
Packing list: page frame, banded tables, numbered columns; flatter, crisper scan
- Layout: the page frame gives its sides back as cell walls; collinear rule
  pieces join; tables split into bands of matching walls; empty merged cells
  are split along shared row/column lines; a logo bar in a cell becomes a picture.
- Re-reading: numbered columns are filled and corrected from their sequence;
  a sign never turns into a letter, and a capital never into its small letter.
- Excel: row edges from every band; table cells shrink to fit.
- Scan: the flatten mesh samples through a homography plus offsets (straight
  rules); the paper background is lifted to white so text reads clearly.
- UI test: settle the Welcome to Pro card before opening the saved document.

Co-Authored-By: Claude Opus 5.5 <noreply@anthropic.com>
Claude-Session: https://claude.ai/code/session_01N2KPqXq9Whv7eR2vrvkBWC
</commit_message>
<xml_diff>
--- a/ios/Verification/office-layout/OfficeSamplePhoto.docx
+++ b/ios/Verification/office-layout/OfficeSamplePhoto.docx
@@ -100,93 +100,11 @@
         </w:drawing>
       </w:r>
     </w:p>
-    <w:p>
-      <w:pPr>
-        <w:spacing w:before="727" w:after="0" w:line="660" w:lineRule="exact"/>
-        <w:ind w:left="988" w:right="-1430"/>
-      </w:pPr>
-      <w:r>
-        <w:rPr>
-          <w:rFonts w:ascii="Arial" w:hAnsi="Arial" w:eastAsia="Malgun Gothic" w:cs="Arial"/>
-          <w:spacing w:val="39"/>
-          <w:sz w:val="43"/>
-          <w:szCs w:val="43"/>
-        </w:rPr>
-        <w:t xml:space="preserve">MYRIAD</w:t>
-      </w:r>
-    </w:p>
-    <w:p>
-      <w:pPr>
-        <w:spacing w:before="0" w:after="0" w:line="180" w:lineRule="exact"/>
-        <w:ind w:left="1164" w:right="-1430"/>
-      </w:pPr>
-      <w:r>
-        <w:rPr>
-          <w:rFonts w:ascii="Arial" w:hAnsi="Arial" w:eastAsia="Malgun Gothic" w:cs="Arial"/>
-          <w:spacing w:val="37"/>
-          <w:sz w:val="15"/>
-          <w:szCs w:val="15"/>
-        </w:rPr>
-        <w:t xml:space="preserve">HEART OF BURQUITLAM</w:t>
-      </w:r>
-    </w:p>
-    <w:p>
-      <w:pPr>
-        <w:spacing w:before="1223" w:after="0" w:line="348" w:lineRule="exact"/>
-        <w:ind w:left="1003"/>
-        <w:jc w:val="center"/>
-      </w:pPr>
-      <w:r>
-        <w:rPr>
-          <w:rFonts w:ascii="Arial" w:hAnsi="Arial" w:eastAsia="Malgun Gothic" w:cs="Arial"/>
-          <w:b/>
-          <w:bCs/>
-          <w:spacing w:val="-9"/>
-          <w:sz w:val="29"/>
-          <w:szCs w:val="29"/>
-        </w:rPr>
-        <w:t xml:space="preserve">Myriad - Prices at a Glance</w:t>
-      </w:r>
-    </w:p>
-    <w:p>
-      <w:pPr>
-        <w:spacing w:before="150" w:after="0" w:line="240" w:lineRule="exact"/>
-        <w:ind w:left="980"/>
-        <w:jc w:val="center"/>
-      </w:pPr>
-      <w:r>
-        <w:rPr>
-          <w:rFonts w:ascii="Arial" w:hAnsi="Arial" w:eastAsia="Malgun Gothic" w:cs="Arial"/>
-          <w:b/>
-          <w:bCs/>
-          <w:spacing w:val="-7"/>
-          <w:sz w:val="20"/>
-          <w:szCs w:val="20"/>
-        </w:rPr>
-        <w:t xml:space="preserve">October</w:t>
-      </w:r>
-      <w:r>
-        <w:rPr>
-          <w:rFonts w:ascii="Arial" w:hAnsi="Arial" w:eastAsia="Malgun Gothic" w:cs="Arial"/>
-          <w:spacing w:val="-7"/>
-          <w:sz w:val="20"/>
-          <w:szCs w:val="20"/>
-        </w:rPr>
-        <w:t xml:space="preserve"> 2021</w:t>
-      </w:r>
-    </w:p>
-    <w:p>
-      <w:pPr>
-        <w:spacing w:before="0" w:after="0" w:line="626" w:lineRule="exact"/>
-        <w:rPr>
-          <w:sz w:val="2"/>
-        </w:rPr>
-      </w:pPr>
-    </w:p>
     <w:tbl>
       <w:tblPr>
+        <w:tblpPr w:leftFromText="0" w:rightFromText="0" w:topFromText="0" w:bottomFromText="0" w:vertAnchor="page" w:horzAnchor="page" w:tblpX="1661" w:tblpY="4815"/>
+        <w:tblOverlap w:val="overlap"/>
         <w:tblW w:w="8802" w:type="dxa"/>
-        <w:tblInd w:w="1024" w:type="dxa"/>
         <w:tblBorders>
           <w:top w:val="nil"/>
           <w:left w:val="nil"/>
@@ -212,7 +130,7 @@
       </w:tblGrid>
       <w:tr>
         <w:trPr>
-          <w:trHeight w:val="495" w:hRule="exact"/>
+          <w:trHeight w:val="502" w:hRule="exact"/>
           <w:cantSplit/>
         </w:trPr>
         <w:tc>
@@ -326,7 +244,7 @@
       </w:tr>
       <w:tr>
         <w:trPr>
-          <w:trHeight w:val="497" w:hRule="exact"/>
+          <w:trHeight w:val="512" w:hRule="exact"/>
           <w:cantSplit/>
         </w:trPr>
         <w:tc>
@@ -438,7 +356,7 @@
       </w:tr>
       <w:tr>
         <w:trPr>
-          <w:trHeight w:val="437" w:hRule="exact"/>
+          <w:trHeight w:val="444" w:hRule="exact"/>
           <w:cantSplit/>
         </w:trPr>
         <w:tc>
@@ -552,7 +470,7 @@
       </w:tr>
       <w:tr>
         <w:trPr>
-          <w:trHeight w:val="440" w:hRule="exact"/>
+          <w:trHeight w:val="429" w:hRule="exact"/>
           <w:cantSplit/>
         </w:trPr>
         <w:tc>
@@ -662,7 +580,7 @@
       </w:tr>
       <w:tr>
         <w:trPr>
-          <w:trHeight w:val="463" w:hRule="exact"/>
+          <w:trHeight w:val="453" w:hRule="exact"/>
           <w:cantSplit/>
         </w:trPr>
         <w:tc>
@@ -772,7 +690,7 @@
       </w:tr>
       <w:tr>
         <w:trPr>
-          <w:trHeight w:val="490" w:hRule="exact"/>
+          <w:trHeight w:val="503" w:hRule="exact"/>
           <w:cantSplit/>
         </w:trPr>
         <w:tc>
@@ -882,7 +800,7 @@
       </w:tr>
       <w:tr>
         <w:trPr>
-          <w:trHeight w:val="491" w:hRule="exact"/>
+          <w:trHeight w:val="493" w:hRule="exact"/>
           <w:cantSplit/>
         </w:trPr>
         <w:tc>
@@ -992,7 +910,7 @@
       </w:tr>
       <w:tr>
         <w:trPr>
-          <w:trHeight w:val="421" w:hRule="exact"/>
+          <w:trHeight w:val="407" w:hRule="exact"/>
           <w:cantSplit/>
         </w:trPr>
         <w:tc>
@@ -1103,229 +1021,1173 @@
     </w:tbl>
     <w:p>
       <w:pPr>
-        <w:spacing w:before="648" w:after="0" w:line="240" w:lineRule="exact"/>
-        <w:ind w:left="1065" w:right="-1430"/>
+        <w:spacing w:before="0" w:after="0" w:line="20" w:lineRule="exact"/>
+        <w:rPr>
+          <w:sz w:val="2"/>
+        </w:rPr>
       </w:pPr>
-      <w:r>
-        <w:rPr>
-          <w:rFonts w:ascii="Arial" w:hAnsi="Arial" w:eastAsia="Malgun Gothic" w:cs="Arial"/>
-          <w:spacing w:val="7"/>
-          <w:sz w:val="20"/>
-          <w:szCs w:val="20"/>
-        </w:rPr>
-        <w:t xml:space="preserve">Deposit Structure:</w:t>
-      </w:r>
     </w:p>
     <w:p>
       <w:pPr>
-        <w:numPr>
-          <w:ilvl w:val="0"/>
-          <w:numId w:val="1"/>
-        </w:numPr>
-        <w:spacing w:before="182" w:after="0" w:line="252" w:lineRule="exact"/>
-        <w:ind w:left="1757" w:right="-1430" w:hanging="358"/>
+        <w:spacing w:before="0" w:after="0" w:line="20" w:lineRule="exact"/>
+        <w:rPr>
+          <w:sz w:val="2"/>
+        </w:rPr>
       </w:pPr>
       <w:r>
-        <w:rPr>
-          <w:rFonts w:ascii="Arial" w:hAnsi="Arial" w:eastAsia="Malgun Gothic" w:cs="Arial"/>
-          <w:spacing w:val="2"/>
-          <w:sz w:val="21"/>
-          <w:szCs w:val="21"/>
-        </w:rPr>
-        <w:t xml:space="preserve">Initial $10,000 bank draft due upon signing Offer to Purchase and Agreement Sale;</w:t>
-      </w:r>
-    </w:p>
-    <w:p>
-      <w:pPr>
-        <w:numPr>
-          <w:ilvl w:val="0"/>
-          <w:numId w:val="1"/>
-        </w:numPr>
-        <w:spacing w:before="27" w:after="0" w:line="240" w:lineRule="exact"/>
-        <w:ind w:left="1745" w:right="-1430" w:hanging="346"/>
-      </w:pPr>
-      <w:r>
-        <w:rPr>
-          <w:rFonts w:ascii="Arial" w:hAnsi="Arial" w:eastAsia="Malgun Gothic" w:cs="Arial"/>
-          <w:spacing w:val="5"/>
-          <w:sz w:val="20"/>
-          <w:szCs w:val="20"/>
-        </w:rPr>
-        <w:t xml:space="preserve">5% within 7 days (less $10,000 initial deposit) upon signing;</w:t>
-      </w:r>
-    </w:p>
-    <w:p>
-      <w:pPr>
-        <w:numPr>
-          <w:ilvl w:val="0"/>
-          <w:numId w:val="1"/>
-        </w:numPr>
-        <w:spacing w:before="28" w:after="0" w:line="228" w:lineRule="exact"/>
-        <w:ind w:left="1739" w:right="-1430" w:hanging="421"/>
-      </w:pPr>
-      <w:r>
-        <w:rPr>
-          <w:rFonts w:ascii="Arial" w:hAnsi="Arial" w:eastAsia="Malgun Gothic" w:cs="Arial"/>
-          <w:spacing w:val="2"/>
-          <w:sz w:val="19"/>
-          <w:szCs w:val="19"/>
-        </w:rPr>
-        <w:t xml:space="preserve">5% in 180 days;</w:t>
-      </w:r>
-    </w:p>
-    <w:p>
-      <w:pPr>
-        <w:numPr>
-          <w:ilvl w:val="0"/>
-          <w:numId w:val="1"/>
-        </w:numPr>
-        <w:spacing w:before="28" w:after="0" w:line="240" w:lineRule="exact"/>
-        <w:ind w:left="1739" w:right="-1430" w:hanging="346"/>
-      </w:pPr>
-      <w:r>
-        <w:rPr>
-          <w:rFonts w:ascii="Arial" w:hAnsi="Arial" w:eastAsia="Malgun Gothic" w:cs="Arial"/>
-          <w:spacing w:val="-2"/>
-          <w:sz w:val="20"/>
-          <w:szCs w:val="20"/>
-        </w:rPr>
-        <w:t xml:space="preserve">5% in 365 days;</w:t>
-      </w:r>
-    </w:p>
-    <w:p>
-      <w:pPr>
-        <w:numPr>
-          <w:ilvl w:val="0"/>
-          <w:numId w:val="1"/>
-        </w:numPr>
-        <w:spacing w:before="12" w:after="0" w:line="240" w:lineRule="exact"/>
-        <w:ind w:left="1739" w:right="-1430" w:hanging="346"/>
-      </w:pPr>
-      <w:r>
-        <w:rPr>
-          <w:rFonts w:ascii="Arial" w:hAnsi="Arial" w:eastAsia="Malgun Gothic" w:cs="Arial"/>
-          <w:sz w:val="20"/>
-          <w:szCs w:val="20"/>
-        </w:rPr>
-        <w:t xml:space="preserve">5% in 730 days.</w:t>
-      </w:r>
-    </w:p>
-    <w:p>
-      <w:pPr>
-        <w:numPr>
-          <w:ilvl w:val="0"/>
-          <w:numId w:val="1"/>
-        </w:numPr>
-        <w:spacing w:before="38" w:after="0" w:line="252" w:lineRule="exact"/>
-        <w:ind w:left="1745" w:right="-1430" w:hanging="346"/>
-      </w:pPr>
-      <w:r>
-        <w:rPr>
-          <w:rFonts w:ascii="Arial" w:hAnsi="Arial" w:eastAsia="Malgun Gothic" w:cs="Arial"/>
-          <w:spacing w:val="2"/>
-          <w:sz w:val="21"/>
-          <w:szCs w:val="21"/>
-        </w:rPr>
-        <w:t xml:space="preserve">Certified cheques or bank drafts made out to</w:t>
+        <w:drawing>
+          <wp:anchor distT="0" distB="0" distL="0" distR="0" simplePos="0" relativeHeight="5000" behindDoc="0" locked="0" layoutInCell="1" allowOverlap="1">
+            <wp:simplePos x="0" y="0"/>
+            <wp:positionH relativeFrom="page">
+              <wp:posOffset>1032097</wp:posOffset>
+            </wp:positionH>
+            <wp:positionV relativeFrom="page">
+              <wp:posOffset>755523</wp:posOffset>
+            </wp:positionV>
+            <wp:extent cx="2199579" cy="419100"/>
+            <wp:effectExtent l="0" t="0" r="0" b="0"/>
+            <wp:wrapNone/>
+            <wp:docPr id="5000" name="Text 5000"/>
+            <wp:cNvGraphicFramePr/>
+            <a:graphic>
+              <a:graphicData uri="http://schemas.microsoft.com/office/word/2010/wordprocessingShape">
+                <wps:wsp>
+                  <wps:cNvSpPr txBox="1"/>
+                  <wps:spPr>
+                    <a:xfrm>
+                      <a:off x="0" y="0"/>
+                      <a:ext cx="2199579" cy="419100"/>
+                    </a:xfrm>
+                    <a:prstGeom prst="rect">
+                      <a:avLst/>
+                    </a:prstGeom>
+                    <a:noFill/>
+                    <a:ln>
+                      <a:noFill/>
+                    </a:ln>
+                  </wps:spPr>
+                  <wps:txbx>
+                    <w:txbxContent>
+                      <w:p>
+                        <w:pPr>
+                          <w:spacing w:before="0" w:after="0" w:line="240" w:lineRule="auto"/>
+                          <w:jc w:val="left"/>
+                        </w:pPr>
+                        <w:r>
+                          <w:rPr>
+                            <w:rFonts w:ascii="Arial" w:hAnsi="Arial" w:eastAsia="Malgun Gothic" w:cs="Arial"/>
+                            <w:spacing w:val="39"/>
+                            <w:sz w:val="43"/>
+                            <w:szCs w:val="43"/>
+                          </w:rPr>
+                          <w:t xml:space="preserve">MYRIAD</w:t>
+                        </w:r>
+                      </w:p>
+                    </w:txbxContent>
+                  </wps:txbx>
+                  <wps:bodyPr rot="0" vert="horz" wrap="none" lIns="0" tIns="0" rIns="0" bIns="0" anchor="ctr" anchorCtr="0">
+                    <a:noAutofit/>
+                  </wps:bodyPr>
+                </wps:wsp>
+              </a:graphicData>
+            </a:graphic>
+          </wp:anchor>
+        </w:drawing>
       </w:r>
       <w:r>
-        <w:rPr>
-          <w:rFonts w:ascii="Arial" w:hAnsi="Arial" w:eastAsia="Malgun Gothic" w:cs="Arial"/>
-          <w:b/>
-          <w:bCs/>
-          <w:spacing w:val="2"/>
-          <w:sz w:val="21"/>
-          <w:szCs w:val="21"/>
-        </w:rPr>
-        <w:t xml:space="preserve"> Terra Law Corp. in trust'.</w:t>
-      </w:r>
-    </w:p>
-    <w:p>
-      <w:pPr>
-        <w:spacing w:before="1029" w:after="0" w:line="153" w:lineRule="exact"/>
-        <w:ind w:left="1065" w:right="-1430"/>
-      </w:pPr>
-      <w:r>
-        <w:rPr>
-          <w:rFonts w:ascii="Arial" w:hAnsi="Arial" w:eastAsia="Malgun Gothic" w:cs="Arial"/>
-          <w:spacing w:val="-2"/>
-          <w:sz w:val="13"/>
-          <w:szCs w:val="13"/>
-        </w:rPr>
-        <w:t xml:space="preserve">Prices do not include GST, may change without notice and are subject to availability. Sulte sizes may vary on final Strata Plan. Concert reserves the right to</w:t>
+        <w:drawing>
+          <wp:anchor distT="0" distB="0" distL="0" distR="0" simplePos="0" relativeHeight="5001" behindDoc="0" locked="0" layoutInCell="1" allowOverlap="1">
+            <wp:simplePos x="0" y="0"/>
+            <wp:positionH relativeFrom="page">
+              <wp:posOffset>1143877</wp:posOffset>
+            </wp:positionH>
+            <wp:positionV relativeFrom="page">
+              <wp:posOffset>1168844</wp:posOffset>
+            </wp:positionV>
+            <wp:extent cx="2149012" cy="114300"/>
+            <wp:effectExtent l="0" t="0" r="0" b="0"/>
+            <wp:wrapNone/>
+            <wp:docPr id="5001" name="Text 5001"/>
+            <wp:cNvGraphicFramePr/>
+            <a:graphic>
+              <a:graphicData uri="http://schemas.microsoft.com/office/word/2010/wordprocessingShape">
+                <wps:wsp>
+                  <wps:cNvSpPr txBox="1"/>
+                  <wps:spPr>
+                    <a:xfrm>
+                      <a:off x="0" y="0"/>
+                      <a:ext cx="2149012" cy="114300"/>
+                    </a:xfrm>
+                    <a:prstGeom prst="rect">
+                      <a:avLst/>
+                    </a:prstGeom>
+                    <a:noFill/>
+                    <a:ln>
+                      <a:noFill/>
+                    </a:ln>
+                  </wps:spPr>
+                  <wps:txbx>
+                    <w:txbxContent>
+                      <w:p>
+                        <w:pPr>
+                          <w:spacing w:before="0" w:after="0" w:line="240" w:lineRule="auto"/>
+                          <w:jc w:val="left"/>
+                        </w:pPr>
+                        <w:r>
+                          <w:rPr>
+                            <w:rFonts w:ascii="Arial" w:hAnsi="Arial" w:eastAsia="Malgun Gothic" w:cs="Arial"/>
+                            <w:spacing w:val="39"/>
+                            <w:sz w:val="15"/>
+                            <w:szCs w:val="15"/>
+                          </w:rPr>
+                          <w:t xml:space="preserve">HEART OF BURQUITLAM</w:t>
+                        </w:r>
+                      </w:p>
+                    </w:txbxContent>
+                  </wps:txbx>
+                  <wps:bodyPr rot="0" vert="horz" wrap="none" lIns="0" tIns="0" rIns="0" bIns="0" anchor="ctr" anchorCtr="0">
+                    <a:noAutofit/>
+                  </wps:bodyPr>
+                </wps:wsp>
+              </a:graphicData>
+            </a:graphic>
+          </wp:anchor>
+        </w:drawing>
       </w:r>
       <w:r>
-        <w:br/>
+        <w:drawing>
+          <wp:anchor distT="0" distB="0" distL="0" distR="0" simplePos="0" relativeHeight="5002" behindDoc="0" locked="0" layoutInCell="1" allowOverlap="1">
+            <wp:simplePos x="0" y="0"/>
+            <wp:positionH relativeFrom="page">
+              <wp:posOffset>2373221</wp:posOffset>
+            </wp:positionH>
+            <wp:positionV relativeFrom="page">
+              <wp:posOffset>2134036</wp:posOffset>
+            </wp:positionV>
+            <wp:extent cx="3134011" cy="220980"/>
+            <wp:effectExtent l="0" t="0" r="0" b="0"/>
+            <wp:wrapNone/>
+            <wp:docPr id="5002" name="Text 5002"/>
+            <wp:cNvGraphicFramePr/>
+            <a:graphic>
+              <a:graphicData uri="http://schemas.microsoft.com/office/word/2010/wordprocessingShape">
+                <wps:wsp>
+                  <wps:cNvSpPr txBox="1"/>
+                  <wps:spPr>
+                    <a:xfrm>
+                      <a:off x="0" y="0"/>
+                      <a:ext cx="3134011" cy="220980"/>
+                    </a:xfrm>
+                    <a:prstGeom prst="rect">
+                      <a:avLst/>
+                    </a:prstGeom>
+                    <a:noFill/>
+                    <a:ln>
+                      <a:noFill/>
+                    </a:ln>
+                  </wps:spPr>
+                  <wps:txbx>
+                    <w:txbxContent>
+                      <w:p>
+                        <w:pPr>
+                          <w:spacing w:before="0" w:after="0" w:line="240" w:lineRule="auto"/>
+                          <w:jc w:val="center"/>
+                        </w:pPr>
+                        <w:r>
+                          <w:rPr>
+                            <w:rFonts w:ascii="Arial" w:hAnsi="Arial" w:eastAsia="Malgun Gothic" w:cs="Arial"/>
+                            <w:b/>
+                            <w:bCs/>
+                            <w:spacing w:val="-6"/>
+                            <w:sz w:val="29"/>
+                            <w:szCs w:val="29"/>
+                          </w:rPr>
+                          <w:t xml:space="preserve">Myriad - Prices at a Glance</w:t>
+                        </w:r>
+                      </w:p>
+                    </w:txbxContent>
+                  </wps:txbx>
+                  <wps:bodyPr rot="0" vert="horz" wrap="none" lIns="0" tIns="0" rIns="0" bIns="0" anchor="ctr" anchorCtr="0">
+                    <a:noAutofit/>
+                  </wps:bodyPr>
+                </wps:wsp>
+              </a:graphicData>
+            </a:graphic>
+          </wp:anchor>
+        </w:drawing>
       </w:r>
       <w:r>
-        <w:rPr>
-          <w:rFonts w:ascii="Arial" w:hAnsi="Arial" w:eastAsia="Malgun Gothic" w:cs="Arial"/>
-          <w:spacing w:val="-2"/>
-          <w:sz w:val="12"/>
-          <w:szCs w:val="12"/>
-        </w:rPr>
-        <w:t xml:space="preserve">nake modifications and changes to floorplans, project design, specifications and features. October 2021. CONCERT REALTY SERVICES LTD. E.8O.!</w:t>
-      </w:r>
-    </w:p>
-    <w:p>
-      <w:pPr>
-        <w:spacing w:before="959" w:after="0" w:line="196" w:lineRule="exact"/>
-        <w:ind w:left="1047" w:right="-1430"/>
-      </w:pPr>
-      <w:r>
-        <w:rPr>
-          <w:rFonts w:ascii="Arial" w:hAnsi="Arial" w:eastAsia="Malgun Gothic" w:cs="Arial"/>
-          <w:b/>
-          <w:bCs/>
-          <w:spacing w:val="-5"/>
-          <w:sz w:val="14"/>
-          <w:szCs w:val="14"/>
-        </w:rPr>
-        <w:t xml:space="preserve">MyriadbyConcert.com</w:t>
+        <w:drawing>
+          <wp:anchor distT="0" distB="0" distL="0" distR="0" simplePos="0" relativeHeight="5003" behindDoc="0" locked="0" layoutInCell="1" allowOverlap="1">
+            <wp:simplePos x="0" y="0"/>
+            <wp:positionH relativeFrom="page">
+              <wp:posOffset>3358256</wp:posOffset>
+            </wp:positionH>
+            <wp:positionV relativeFrom="page">
+              <wp:posOffset>2468083</wp:posOffset>
+            </wp:positionV>
+            <wp:extent cx="1149037" cy="152400"/>
+            <wp:effectExtent l="0" t="0" r="0" b="0"/>
+            <wp:wrapNone/>
+            <wp:docPr id="5003" name="Text 5003"/>
+            <wp:cNvGraphicFramePr/>
+            <a:graphic>
+              <a:graphicData uri="http://schemas.microsoft.com/office/word/2010/wordprocessingShape">
+                <wps:wsp>
+                  <wps:cNvSpPr txBox="1"/>
+                  <wps:spPr>
+                    <a:xfrm>
+                      <a:off x="0" y="0"/>
+                      <a:ext cx="1149037" cy="152400"/>
+                    </a:xfrm>
+                    <a:prstGeom prst="rect">
+                      <a:avLst/>
+                    </a:prstGeom>
+                    <a:noFill/>
+                    <a:ln>
+                      <a:noFill/>
+                    </a:ln>
+                  </wps:spPr>
+                  <wps:txbx>
+                    <w:txbxContent>
+                      <w:p>
+                        <w:pPr>
+                          <w:spacing w:before="0" w:after="0" w:line="240" w:lineRule="auto"/>
+                          <w:jc w:val="center"/>
+                        </w:pPr>
+                        <w:r>
+                          <w:rPr>
+                            <w:rFonts w:ascii="Arial" w:hAnsi="Arial" w:eastAsia="Malgun Gothic" w:cs="Arial"/>
+                            <w:b/>
+                            <w:bCs/>
+                            <w:spacing w:val="-5"/>
+                            <w:sz w:val="20"/>
+                            <w:szCs w:val="20"/>
+                          </w:rPr>
+                          <w:t xml:space="preserve">October</w:t>
+                        </w:r>
+                        <w:r>
+                          <w:rPr>
+                            <w:rFonts w:ascii="Arial" w:hAnsi="Arial" w:eastAsia="Malgun Gothic" w:cs="Arial"/>
+                            <w:spacing w:val="-5"/>
+                            <w:sz w:val="20"/>
+                            <w:szCs w:val="20"/>
+                          </w:rPr>
+                          <w:t xml:space="preserve"> 2021</w:t>
+                        </w:r>
+                      </w:p>
+                    </w:txbxContent>
+                  </wps:txbx>
+                  <wps:bodyPr rot="0" vert="horz" wrap="none" lIns="0" tIns="0" rIns="0" bIns="0" anchor="ctr" anchorCtr="0">
+                    <a:noAutofit/>
+                  </wps:bodyPr>
+                </wps:wsp>
+              </a:graphicData>
+            </a:graphic>
+          </wp:anchor>
+        </w:drawing>
       </w:r>
       <w:r>
-        <w:br/>
+        <w:drawing>
+          <wp:anchor distT="0" distB="0" distL="0" distR="0" simplePos="0" relativeHeight="5004" behindDoc="0" locked="0" layoutInCell="1" allowOverlap="1">
+            <wp:simplePos x="0" y="0"/>
+            <wp:positionH relativeFrom="page">
+              <wp:posOffset>1080535</wp:posOffset>
+            </wp:positionH>
+            <wp:positionV relativeFrom="page">
+              <wp:posOffset>5897299</wp:posOffset>
+            </wp:positionV>
+            <wp:extent cx="1565602" cy="152400"/>
+            <wp:effectExtent l="0" t="0" r="0" b="0"/>
+            <wp:wrapNone/>
+            <wp:docPr id="5004" name="Text 5004"/>
+            <wp:cNvGraphicFramePr/>
+            <a:graphic>
+              <a:graphicData uri="http://schemas.microsoft.com/office/word/2010/wordprocessingShape">
+                <wps:wsp>
+                  <wps:cNvSpPr txBox="1"/>
+                  <wps:spPr>
+                    <a:xfrm>
+                      <a:off x="0" y="0"/>
+                      <a:ext cx="1565602" cy="152400"/>
+                    </a:xfrm>
+                    <a:prstGeom prst="rect">
+                      <a:avLst/>
+                    </a:prstGeom>
+                    <a:noFill/>
+                    <a:ln>
+                      <a:noFill/>
+                    </a:ln>
+                  </wps:spPr>
+                  <wps:txbx>
+                    <w:txbxContent>
+                      <w:p>
+                        <w:pPr>
+                          <w:spacing w:before="0" w:after="0" w:line="240" w:lineRule="auto"/>
+                          <w:jc w:val="left"/>
+                        </w:pPr>
+                        <w:r>
+                          <w:rPr>
+                            <w:rFonts w:ascii="Arial" w:hAnsi="Arial" w:eastAsia="Malgun Gothic" w:cs="Arial"/>
+                            <w:spacing w:val="8"/>
+                            <w:sz w:val="20"/>
+                            <w:szCs w:val="20"/>
+                          </w:rPr>
+                          <w:t xml:space="preserve">Deposit Structure:</w:t>
+                        </w:r>
+                      </w:p>
+                    </w:txbxContent>
+                  </wps:txbx>
+                  <wps:bodyPr rot="0" vert="horz" wrap="none" lIns="0" tIns="0" rIns="0" bIns="0" anchor="ctr" anchorCtr="0">
+                    <a:noAutofit/>
+                  </wps:bodyPr>
+                </wps:wsp>
+              </a:graphicData>
+            </a:graphic>
+          </wp:anchor>
+        </w:drawing>
       </w:r>
       <w:r>
-        <w:rPr>
-          <w:rFonts w:ascii="Arial" w:hAnsi="Arial" w:eastAsia="Malgun Gothic" w:cs="Arial"/>
-          <w:spacing w:val="-5"/>
-          <w:sz w:val="15"/>
-          <w:szCs w:val="15"/>
-        </w:rPr>
-        <w:t xml:space="preserve">101 - 511 Clarke Road, Coquitlam, BC V3J 0J1</w:t>
-      </w:r>
-    </w:p>
-    <w:p>
-      <w:pPr>
-        <w:tabs>
-          <w:tab w:val="right" w:pos="10113"/>
-        </w:tabs>
-        <w:spacing w:before="28" w:after="0" w:line="180" w:lineRule="exact"/>
-        <w:ind w:left="1041" w:right="-1430"/>
-      </w:pPr>
-      <w:r>
-        <w:rPr>
-          <w:rFonts w:ascii="Arial" w:hAnsi="Arial" w:eastAsia="Malgun Gothic" w:cs="Arial"/>
-          <w:spacing w:val="-12"/>
-          <w:sz w:val="15"/>
-          <w:szCs w:val="15"/>
-        </w:rPr>
-        <w:t xml:space="preserve">604.335.0696 | Admin.Myriad@ConcertProperties.com</w:t>
+        <w:drawing>
+          <wp:anchor distT="0" distB="0" distL="0" distR="0" simplePos="0" relativeHeight="5005" behindDoc="0" locked="0" layoutInCell="1" allowOverlap="1">
+            <wp:simplePos x="0" y="0"/>
+            <wp:positionH relativeFrom="page">
+              <wp:posOffset>1292916</wp:posOffset>
+            </wp:positionH>
+            <wp:positionV relativeFrom="page">
+              <wp:posOffset>6181997</wp:posOffset>
+            </wp:positionV>
+            <wp:extent cx="6943329" cy="160020"/>
+            <wp:effectExtent l="0" t="0" r="0" b="0"/>
+            <wp:wrapNone/>
+            <wp:docPr id="5005" name="Text 5005"/>
+            <wp:cNvGraphicFramePr/>
+            <a:graphic>
+              <a:graphicData uri="http://schemas.microsoft.com/office/word/2010/wordprocessingShape">
+                <wps:wsp>
+                  <wps:cNvSpPr txBox="1"/>
+                  <wps:spPr>
+                    <a:xfrm>
+                      <a:off x="0" y="0"/>
+                      <a:ext cx="6943329" cy="160020"/>
+                    </a:xfrm>
+                    <a:prstGeom prst="rect">
+                      <a:avLst/>
+                    </a:prstGeom>
+                    <a:noFill/>
+                    <a:ln>
+                      <a:noFill/>
+                    </a:ln>
+                  </wps:spPr>
+                  <wps:txbx>
+                    <w:txbxContent>
+                      <w:p>
+                        <w:pPr>
+                          <w:spacing w:before="0" w:after="0" w:line="240" w:lineRule="auto"/>
+                          <w:jc w:val="left"/>
+                        </w:pPr>
+                        <w:r>
+                          <w:rPr>
+                            <w:rFonts w:ascii="Arial" w:hAnsi="Arial" w:eastAsia="Malgun Gothic" w:cs="Arial"/>
+                            <w:spacing w:val="4"/>
+                            <w:sz w:val="21"/>
+                            <w:szCs w:val="21"/>
+                          </w:rPr>
+                          <w:t xml:space="preserve">•  </w:t>
+                        </w:r>
+                        <w:r>
+                          <w:rPr>
+                            <w:rFonts w:ascii="Arial" w:hAnsi="Arial" w:eastAsia="Malgun Gothic" w:cs="Arial"/>
+                            <w:spacing w:val="4"/>
+                            <w:sz w:val="21"/>
+                            <w:szCs w:val="21"/>
+                          </w:rPr>
+                          <w:t xml:space="preserve">Initial $10,000 bank draft due upon signing Offer to Purchase and Agreement Sale;</w:t>
+                        </w:r>
+                      </w:p>
+                    </w:txbxContent>
+                  </wps:txbx>
+                  <wps:bodyPr rot="0" vert="horz" wrap="none" lIns="0" tIns="0" rIns="0" bIns="0" anchor="ctr" anchorCtr="0">
+                    <a:noAutofit/>
+                  </wps:bodyPr>
+                </wps:wsp>
+              </a:graphicData>
+            </a:graphic>
+          </wp:anchor>
+        </w:drawing>
       </w:r>
       <w:r>
-        <w:tab/>
+        <w:drawing>
+          <wp:anchor distT="0" distB="0" distL="0" distR="0" simplePos="0" relativeHeight="5006" behindDoc="0" locked="0" layoutInCell="1" allowOverlap="1">
+            <wp:simplePos x="0" y="0"/>
+            <wp:positionH relativeFrom="page">
+              <wp:posOffset>1292916</wp:posOffset>
+            </wp:positionH>
+            <wp:positionV relativeFrom="page">
+              <wp:posOffset>6372952</wp:posOffset>
+            </wp:positionV>
+            <wp:extent cx="645284" cy="152400"/>
+            <wp:effectExtent l="0" t="0" r="0" b="0"/>
+            <wp:wrapNone/>
+            <wp:docPr id="5006" name="Text 5006"/>
+            <wp:cNvGraphicFramePr/>
+            <a:graphic>
+              <a:graphicData uri="http://schemas.microsoft.com/office/word/2010/wordprocessingShape">
+                <wps:wsp>
+                  <wps:cNvSpPr txBox="1"/>
+                  <wps:spPr>
+                    <a:xfrm>
+                      <a:off x="0" y="0"/>
+                      <a:ext cx="645284" cy="152400"/>
+                    </a:xfrm>
+                    <a:prstGeom prst="rect">
+                      <a:avLst/>
+                    </a:prstGeom>
+                    <a:noFill/>
+                    <a:ln>
+                      <a:noFill/>
+                    </a:ln>
+                  </wps:spPr>
+                  <wps:txbx>
+                    <w:txbxContent>
+                      <w:p>
+                        <w:pPr>
+                          <w:spacing w:before="0" w:after="0" w:line="240" w:lineRule="auto"/>
+                          <w:jc w:val="left"/>
+                        </w:pPr>
+                        <w:r>
+                          <w:rPr>
+                            <w:rFonts w:ascii="Arial" w:hAnsi="Arial" w:eastAsia="Malgun Gothic" w:cs="Arial"/>
+                            <w:sz w:val="20"/>
+                            <w:szCs w:val="20"/>
+                          </w:rPr>
+                          <w:t xml:space="preserve">pe</w:t>
+                        </w:r>
+                      </w:p>
+                    </w:txbxContent>
+                  </wps:txbx>
+                  <wps:bodyPr rot="0" vert="horz" wrap="none" lIns="0" tIns="0" rIns="0" bIns="0" anchor="ctr" anchorCtr="0">
+                    <a:noAutofit/>
+                  </wps:bodyPr>
+                </wps:wsp>
+              </a:graphicData>
+            </a:graphic>
+          </wp:anchor>
+        </w:drawing>
       </w:r>
       <w:r>
-        <w:rPr>
-          <w:rFonts w:ascii="Arial" w:hAnsi="Arial" w:eastAsia="Malgun Gothic" w:cs="Arial"/>
-          <w:b/>
-          <w:bCs/>
-          <w:spacing w:val="-12"/>
-          <w:sz w:val="28"/>
-          <w:szCs w:val="28"/>
-        </w:rPr>
-        <w:t xml:space="preserve">CONCERT®</w:t>
+        <w:drawing>
+          <wp:anchor distT="0" distB="0" distL="0" distR="0" simplePos="0" relativeHeight="5007" behindDoc="0" locked="0" layoutInCell="1" allowOverlap="1">
+            <wp:simplePos x="0" y="0"/>
+            <wp:positionH relativeFrom="page">
+              <wp:posOffset>1292916</wp:posOffset>
+            </wp:positionH>
+            <wp:positionV relativeFrom="page">
+              <wp:posOffset>6357585</wp:posOffset>
+            </wp:positionV>
+            <wp:extent cx="5006547" cy="152400"/>
+            <wp:effectExtent l="0" t="0" r="0" b="0"/>
+            <wp:wrapNone/>
+            <wp:docPr id="5007" name="Text 5007"/>
+            <wp:cNvGraphicFramePr/>
+            <a:graphic>
+              <a:graphicData uri="http://schemas.microsoft.com/office/word/2010/wordprocessingShape">
+                <wps:wsp>
+                  <wps:cNvSpPr txBox="1"/>
+                  <wps:spPr>
+                    <a:xfrm>
+                      <a:off x="0" y="0"/>
+                      <a:ext cx="5006547" cy="152400"/>
+                    </a:xfrm>
+                    <a:prstGeom prst="rect">
+                      <a:avLst/>
+                    </a:prstGeom>
+                    <a:noFill/>
+                    <a:ln>
+                      <a:noFill/>
+                    </a:ln>
+                  </wps:spPr>
+                  <wps:txbx>
+                    <w:txbxContent>
+                      <w:p>
+                        <w:pPr>
+                          <w:spacing w:before="0" w:after="0" w:line="240" w:lineRule="auto"/>
+                          <w:jc w:val="left"/>
+                        </w:pPr>
+                        <w:r>
+                          <w:rPr>
+                            <w:rFonts w:ascii="Arial" w:hAnsi="Arial" w:eastAsia="Malgun Gothic" w:cs="Arial"/>
+                            <w:spacing w:val="6"/>
+                            <w:sz w:val="20"/>
+                            <w:szCs w:val="20"/>
+                          </w:rPr>
+                          <w:t xml:space="preserve">•  </w:t>
+                        </w:r>
+                        <w:r>
+                          <w:rPr>
+                            <w:rFonts w:ascii="Arial" w:hAnsi="Arial" w:eastAsia="Malgun Gothic" w:cs="Arial"/>
+                            <w:spacing w:val="6"/>
+                            <w:sz w:val="20"/>
+                            <w:szCs w:val="20"/>
+                          </w:rPr>
+                          <w:t xml:space="preserve">5% within 7 days (less $10,000 initial deposit) upon signing;</w:t>
+                        </w:r>
+                      </w:p>
+                    </w:txbxContent>
+                  </wps:txbx>
+                  <wps:bodyPr rot="0" vert="horz" wrap="none" lIns="0" tIns="0" rIns="0" bIns="0" anchor="ctr" anchorCtr="0">
+                    <a:noAutofit/>
+                  </wps:bodyPr>
+                </wps:wsp>
+              </a:graphicData>
+            </a:graphic>
+          </wp:anchor>
+        </w:drawing>
+      </w:r>
+      <w:r>
+        <w:drawing>
+          <wp:anchor distT="0" distB="0" distL="0" distR="0" simplePos="0" relativeHeight="5008" behindDoc="0" locked="0" layoutInCell="1" allowOverlap="1">
+            <wp:simplePos x="0" y="0"/>
+            <wp:positionH relativeFrom="page">
+              <wp:posOffset>1292916</wp:posOffset>
+            </wp:positionH>
+            <wp:positionV relativeFrom="page">
+              <wp:posOffset>6529687</wp:posOffset>
+            </wp:positionV>
+            <wp:extent cx="1494420" cy="144780"/>
+            <wp:effectExtent l="0" t="0" r="0" b="0"/>
+            <wp:wrapNone/>
+            <wp:docPr id="5008" name="Text 5008"/>
+            <wp:cNvGraphicFramePr/>
+            <a:graphic>
+              <a:graphicData uri="http://schemas.microsoft.com/office/word/2010/wordprocessingShape">
+                <wps:wsp>
+                  <wps:cNvSpPr txBox="1"/>
+                  <wps:spPr>
+                    <a:xfrm>
+                      <a:off x="0" y="0"/>
+                      <a:ext cx="1494420" cy="144780"/>
+                    </a:xfrm>
+                    <a:prstGeom prst="rect">
+                      <a:avLst/>
+                    </a:prstGeom>
+                    <a:noFill/>
+                    <a:ln>
+                      <a:noFill/>
+                    </a:ln>
+                  </wps:spPr>
+                  <wps:txbx>
+                    <w:txbxContent>
+                      <w:p>
+                        <w:pPr>
+                          <w:spacing w:before="0" w:after="0" w:line="240" w:lineRule="auto"/>
+                          <w:jc w:val="left"/>
+                        </w:pPr>
+                        <w:r>
+                          <w:rPr>
+                            <w:rFonts w:ascii="Arial" w:hAnsi="Arial" w:eastAsia="Malgun Gothic" w:cs="Arial"/>
+                            <w:spacing w:val="4"/>
+                            <w:sz w:val="19"/>
+                            <w:szCs w:val="19"/>
+                          </w:rPr>
+                          <w:t xml:space="preserve">•  </w:t>
+                        </w:r>
+                        <w:r>
+                          <w:rPr>
+                            <w:rFonts w:ascii="Arial" w:hAnsi="Arial" w:eastAsia="Malgun Gothic" w:cs="Arial"/>
+                            <w:spacing w:val="4"/>
+                            <w:sz w:val="19"/>
+                            <w:szCs w:val="19"/>
+                          </w:rPr>
+                          <w:t xml:space="preserve">5% in 180 days;</w:t>
+                        </w:r>
+                      </w:p>
+                    </w:txbxContent>
+                  </wps:txbx>
+                  <wps:bodyPr rot="0" vert="horz" wrap="none" lIns="0" tIns="0" rIns="0" bIns="0" anchor="ctr" anchorCtr="0">
+                    <a:noAutofit/>
+                  </wps:bodyPr>
+                </wps:wsp>
+              </a:graphicData>
+            </a:graphic>
+          </wp:anchor>
+        </w:drawing>
+      </w:r>
+      <w:r>
+        <w:drawing>
+          <wp:anchor distT="0" distB="0" distL="0" distR="0" simplePos="0" relativeHeight="5009" behindDoc="0" locked="0" layoutInCell="1" allowOverlap="1">
+            <wp:simplePos x="0" y="0"/>
+            <wp:positionH relativeFrom="page">
+              <wp:posOffset>1289190</wp:posOffset>
+            </wp:positionH>
+            <wp:positionV relativeFrom="page">
+              <wp:posOffset>6693932</wp:posOffset>
+            </wp:positionV>
+            <wp:extent cx="1514183" cy="152400"/>
+            <wp:effectExtent l="0" t="0" r="0" b="0"/>
+            <wp:wrapNone/>
+            <wp:docPr id="5009" name="Text 5009"/>
+            <wp:cNvGraphicFramePr/>
+            <a:graphic>
+              <a:graphicData uri="http://schemas.microsoft.com/office/word/2010/wordprocessingShape">
+                <wps:wsp>
+                  <wps:cNvSpPr txBox="1"/>
+                  <wps:spPr>
+                    <a:xfrm>
+                      <a:off x="0" y="0"/>
+                      <a:ext cx="1514183" cy="152400"/>
+                    </a:xfrm>
+                    <a:prstGeom prst="rect">
+                      <a:avLst/>
+                    </a:prstGeom>
+                    <a:noFill/>
+                    <a:ln>
+                      <a:noFill/>
+                    </a:ln>
+                  </wps:spPr>
+                  <wps:txbx>
+                    <w:txbxContent>
+                      <w:p>
+                        <w:pPr>
+                          <w:spacing w:before="0" w:after="0" w:line="240" w:lineRule="auto"/>
+                          <w:jc w:val="left"/>
+                        </w:pPr>
+                        <w:r>
+                          <w:rPr>
+                            <w:rFonts w:ascii="Arial" w:hAnsi="Arial" w:eastAsia="Malgun Gothic" w:cs="Arial"/>
+                            <w:sz w:val="20"/>
+                            <w:szCs w:val="20"/>
+                          </w:rPr>
+                          <w:t xml:space="preserve">•  </w:t>
+                        </w:r>
+                        <w:r>
+                          <w:rPr>
+                            <w:rFonts w:ascii="Arial" w:hAnsi="Arial" w:eastAsia="Malgun Gothic" w:cs="Arial"/>
+                            <w:sz w:val="20"/>
+                            <w:szCs w:val="20"/>
+                          </w:rPr>
+                          <w:t xml:space="preserve">5% in 365 days;</w:t>
+                        </w:r>
+                      </w:p>
+                    </w:txbxContent>
+                  </wps:txbx>
+                  <wps:bodyPr rot="0" vert="horz" wrap="none" lIns="0" tIns="0" rIns="0" bIns="0" anchor="ctr" anchorCtr="0">
+                    <a:noAutofit/>
+                  </wps:bodyPr>
+                </wps:wsp>
+              </a:graphicData>
+            </a:graphic>
+          </wp:anchor>
+        </w:drawing>
+      </w:r>
+      <w:r>
+        <w:drawing>
+          <wp:anchor distT="0" distB="0" distL="0" distR="0" simplePos="0" relativeHeight="5010" behindDoc="0" locked="0" layoutInCell="1" allowOverlap="1">
+            <wp:simplePos x="0" y="0"/>
+            <wp:positionH relativeFrom="page">
+              <wp:posOffset>1289190</wp:posOffset>
+            </wp:positionH>
+            <wp:positionV relativeFrom="page">
+              <wp:posOffset>6855065</wp:posOffset>
+            </wp:positionV>
+            <wp:extent cx="1533558" cy="152400"/>
+            <wp:effectExtent l="0" t="0" r="0" b="0"/>
+            <wp:wrapNone/>
+            <wp:docPr id="5010" name="Text 5010"/>
+            <wp:cNvGraphicFramePr/>
+            <a:graphic>
+              <a:graphicData uri="http://schemas.microsoft.com/office/word/2010/wordprocessingShape">
+                <wps:wsp>
+                  <wps:cNvSpPr txBox="1"/>
+                  <wps:spPr>
+                    <a:xfrm>
+                      <a:off x="0" y="0"/>
+                      <a:ext cx="1533558" cy="152400"/>
+                    </a:xfrm>
+                    <a:prstGeom prst="rect">
+                      <a:avLst/>
+                    </a:prstGeom>
+                    <a:noFill/>
+                    <a:ln>
+                      <a:noFill/>
+                    </a:ln>
+                  </wps:spPr>
+                  <wps:txbx>
+                    <w:txbxContent>
+                      <w:p>
+                        <w:pPr>
+                          <w:spacing w:before="0" w:after="0" w:line="240" w:lineRule="auto"/>
+                          <w:jc w:val="left"/>
+                        </w:pPr>
+                        <w:r>
+                          <w:rPr>
+                            <w:rFonts w:ascii="Arial" w:hAnsi="Arial" w:eastAsia="Malgun Gothic" w:cs="Arial"/>
+                            <w:sz w:val="20"/>
+                            <w:szCs w:val="20"/>
+                          </w:rPr>
+                          <w:t xml:space="preserve">•  </w:t>
+                        </w:r>
+                        <w:r>
+                          <w:rPr>
+                            <w:rFonts w:ascii="Arial" w:hAnsi="Arial" w:eastAsia="Malgun Gothic" w:cs="Arial"/>
+                            <w:sz w:val="20"/>
+                            <w:szCs w:val="20"/>
+                          </w:rPr>
+                          <w:t xml:space="preserve">5% in 730 days.</w:t>
+                        </w:r>
+                      </w:p>
+                    </w:txbxContent>
+                  </wps:txbx>
+                  <wps:bodyPr rot="0" vert="horz" wrap="none" lIns="0" tIns="0" rIns="0" bIns="0" anchor="ctr" anchorCtr="0">
+                    <a:noAutofit/>
+                  </wps:bodyPr>
+                </wps:wsp>
+              </a:graphicData>
+            </a:graphic>
+          </wp:anchor>
+        </w:drawing>
+      </w:r>
+      <w:r>
+        <w:drawing>
+          <wp:anchor distT="0" distB="0" distL="0" distR="0" simplePos="0" relativeHeight="5011" behindDoc="0" locked="0" layoutInCell="1" allowOverlap="1">
+            <wp:simplePos x="0" y="0"/>
+            <wp:positionH relativeFrom="page">
+              <wp:posOffset>1292916</wp:posOffset>
+            </wp:positionH>
+            <wp:positionV relativeFrom="page">
+              <wp:posOffset>7033933</wp:posOffset>
+            </wp:positionV>
+            <wp:extent cx="5942902" cy="160020"/>
+            <wp:effectExtent l="0" t="0" r="0" b="0"/>
+            <wp:wrapNone/>
+            <wp:docPr id="5011" name="Text 5011"/>
+            <wp:cNvGraphicFramePr/>
+            <a:graphic>
+              <a:graphicData uri="http://schemas.microsoft.com/office/word/2010/wordprocessingShape">
+                <wps:wsp>
+                  <wps:cNvSpPr txBox="1"/>
+                  <wps:spPr>
+                    <a:xfrm>
+                      <a:off x="0" y="0"/>
+                      <a:ext cx="5942902" cy="160020"/>
+                    </a:xfrm>
+                    <a:prstGeom prst="rect">
+                      <a:avLst/>
+                    </a:prstGeom>
+                    <a:noFill/>
+                    <a:ln>
+                      <a:noFill/>
+                    </a:ln>
+                  </wps:spPr>
+                  <wps:txbx>
+                    <w:txbxContent>
+                      <w:p>
+                        <w:pPr>
+                          <w:spacing w:before="0" w:after="0" w:line="240" w:lineRule="auto"/>
+                          <w:jc w:val="left"/>
+                        </w:pPr>
+                        <w:r>
+                          <w:rPr>
+                            <w:rFonts w:ascii="Arial" w:hAnsi="Arial" w:eastAsia="Malgun Gothic" w:cs="Arial"/>
+                            <w:spacing w:val="4"/>
+                            <w:sz w:val="21"/>
+                            <w:szCs w:val="21"/>
+                          </w:rPr>
+                          <w:t xml:space="preserve">•  </w:t>
+                        </w:r>
+                        <w:r>
+                          <w:rPr>
+                            <w:rFonts w:ascii="Arial" w:hAnsi="Arial" w:eastAsia="Malgun Gothic" w:cs="Arial"/>
+                            <w:spacing w:val="4"/>
+                            <w:sz w:val="21"/>
+                            <w:szCs w:val="21"/>
+                          </w:rPr>
+                          <w:t xml:space="preserve">Certified cheques or bank drafts made out to</w:t>
+                        </w:r>
+                        <w:r>
+                          <w:rPr>
+                            <w:rFonts w:ascii="Arial" w:hAnsi="Arial" w:eastAsia="Malgun Gothic" w:cs="Arial"/>
+                            <w:b/>
+                            <w:bCs/>
+                            <w:spacing w:val="4"/>
+                            <w:sz w:val="21"/>
+                            <w:szCs w:val="21"/>
+                          </w:rPr>
+                          <w:t xml:space="preserve"> Terra Law Corp. in trust'.</w:t>
+                        </w:r>
+                      </w:p>
+                    </w:txbxContent>
+                  </wps:txbx>
+                  <wps:bodyPr rot="0" vert="horz" wrap="none" lIns="0" tIns="0" rIns="0" bIns="0" anchor="ctr" anchorCtr="0">
+                    <a:noAutofit/>
+                  </wps:bodyPr>
+                </wps:wsp>
+              </a:graphicData>
+            </a:graphic>
+          </wp:anchor>
+        </w:drawing>
+      </w:r>
+      <w:r>
+        <w:drawing>
+          <wp:anchor distT="0" distB="0" distL="0" distR="0" simplePos="0" relativeHeight="5012" behindDoc="0" locked="0" layoutInCell="1" allowOverlap="1">
+            <wp:simplePos x="0" y="0"/>
+            <wp:positionH relativeFrom="page">
+              <wp:posOffset>1065631</wp:posOffset>
+            </wp:positionH>
+            <wp:positionV relativeFrom="page">
+              <wp:posOffset>7920196</wp:posOffset>
+            </wp:positionV>
+            <wp:extent cx="7362748" cy="97409"/>
+            <wp:effectExtent l="0" t="0" r="0" b="0"/>
+            <wp:wrapNone/>
+            <wp:docPr id="5012" name="Text 5012"/>
+            <wp:cNvGraphicFramePr/>
+            <a:graphic>
+              <a:graphicData uri="http://schemas.microsoft.com/office/word/2010/wordprocessingShape">
+                <wps:wsp>
+                  <wps:cNvSpPr txBox="1"/>
+                  <wps:spPr>
+                    <a:xfrm>
+                      <a:off x="0" y="0"/>
+                      <a:ext cx="7362748" cy="97409"/>
+                    </a:xfrm>
+                    <a:prstGeom prst="rect">
+                      <a:avLst/>
+                    </a:prstGeom>
+                    <a:noFill/>
+                    <a:ln>
+                      <a:noFill/>
+                    </a:ln>
+                  </wps:spPr>
+                  <wps:txbx>
+                    <w:txbxContent>
+                      <w:p>
+                        <w:pPr>
+                          <w:spacing w:before="0" w:after="0" w:line="240" w:lineRule="auto"/>
+                          <w:jc w:val="left"/>
+                        </w:pPr>
+                        <w:r>
+                          <w:rPr>
+                            <w:rFonts w:ascii="Arial" w:hAnsi="Arial" w:eastAsia="Malgun Gothic" w:cs="Arial"/>
+                            <w:spacing w:val="2"/>
+                            <w:sz w:val="13"/>
+                            <w:szCs w:val="13"/>
+                          </w:rPr>
+                          <w:t xml:space="preserve">Prices do not include GST, may change without notice and are subject to availability. Suite sizes may vary on final Strata Plan. Concert reserves the right to</w:t>
+                        </w:r>
+                      </w:p>
+                    </w:txbxContent>
+                  </wps:txbx>
+                  <wps:bodyPr rot="0" vert="horz" wrap="none" lIns="0" tIns="0" rIns="0" bIns="0" anchor="ctr" anchorCtr="0">
+                    <a:noAutofit/>
+                  </wps:bodyPr>
+                </wps:wsp>
+              </a:graphicData>
+            </a:graphic>
+          </wp:anchor>
+        </w:drawing>
+      </w:r>
+      <w:r>
+        <w:drawing>
+          <wp:anchor distT="0" distB="0" distL="0" distR="0" simplePos="0" relativeHeight="5013" behindDoc="0" locked="0" layoutInCell="1" allowOverlap="1">
+            <wp:simplePos x="0" y="0"/>
+            <wp:positionH relativeFrom="page">
+              <wp:posOffset>1065631</wp:posOffset>
+            </wp:positionH>
+            <wp:positionV relativeFrom="page">
+              <wp:posOffset>8007701</wp:posOffset>
+            </wp:positionV>
+            <wp:extent cx="6964052" cy="97409"/>
+            <wp:effectExtent l="0" t="0" r="0" b="0"/>
+            <wp:wrapNone/>
+            <wp:docPr id="5013" name="Text 5013"/>
+            <wp:cNvGraphicFramePr/>
+            <a:graphic>
+              <a:graphicData uri="http://schemas.microsoft.com/office/word/2010/wordprocessingShape">
+                <wps:wsp>
+                  <wps:cNvSpPr txBox="1"/>
+                  <wps:spPr>
+                    <a:xfrm>
+                      <a:off x="0" y="0"/>
+                      <a:ext cx="6964052" cy="97409"/>
+                    </a:xfrm>
+                    <a:prstGeom prst="rect">
+                      <a:avLst/>
+                    </a:prstGeom>
+                    <a:noFill/>
+                    <a:ln>
+                      <a:noFill/>
+                    </a:ln>
+                  </wps:spPr>
+                  <wps:txbx>
+                    <w:txbxContent>
+                      <w:p>
+                        <w:pPr>
+                          <w:spacing w:before="0" w:after="0" w:line="240" w:lineRule="auto"/>
+                          <w:jc w:val="left"/>
+                        </w:pPr>
+                        <w:r>
+                          <w:rPr>
+                            <w:rFonts w:ascii="Arial" w:hAnsi="Arial" w:eastAsia="Malgun Gothic" w:cs="Arial"/>
+                            <w:spacing w:val="2"/>
+                            <w:sz w:val="12"/>
+                            <w:szCs w:val="12"/>
+                          </w:rPr>
+                          <w:t xml:space="preserve">make modifications and changes to floorplans, project design, specifications and features. October 2021. CONCERT REALTY SERVICES LTD. E.&amp;O.E.</w:t>
+                        </w:r>
+                      </w:p>
+                    </w:txbxContent>
+                  </wps:txbx>
+                  <wps:bodyPr rot="0" vert="horz" wrap="none" lIns="0" tIns="0" rIns="0" bIns="0" anchor="ctr" anchorCtr="0">
+                    <a:noAutofit/>
+                  </wps:bodyPr>
+                </wps:wsp>
+              </a:graphicData>
+            </a:graphic>
+          </wp:anchor>
+        </w:drawing>
+      </w:r>
+      <w:r>
+        <w:drawing>
+          <wp:anchor distT="0" distB="0" distL="0" distR="0" simplePos="0" relativeHeight="5014" behindDoc="0" locked="0" layoutInCell="1" allowOverlap="1">
+            <wp:simplePos x="0" y="0"/>
+            <wp:positionH relativeFrom="page">
+              <wp:posOffset>1069357</wp:posOffset>
+            </wp:positionH>
+            <wp:positionV relativeFrom="page">
+              <wp:posOffset>8795323</wp:posOffset>
+            </wp:positionV>
+            <wp:extent cx="1401564" cy="116979"/>
+            <wp:effectExtent l="0" t="0" r="0" b="0"/>
+            <wp:wrapNone/>
+            <wp:docPr id="5014" name="Text 5014"/>
+            <wp:cNvGraphicFramePr/>
+            <a:graphic>
+              <a:graphicData uri="http://schemas.microsoft.com/office/word/2010/wordprocessingShape">
+                <wps:wsp>
+                  <wps:cNvSpPr txBox="1"/>
+                  <wps:spPr>
+                    <a:xfrm>
+                      <a:off x="0" y="0"/>
+                      <a:ext cx="1401564" cy="116979"/>
+                    </a:xfrm>
+                    <a:prstGeom prst="rect">
+                      <a:avLst/>
+                    </a:prstGeom>
+                    <a:noFill/>
+                    <a:ln>
+                      <a:noFill/>
+                    </a:ln>
+                  </wps:spPr>
+                  <wps:txbx>
+                    <w:txbxContent>
+                      <w:p>
+                        <w:pPr>
+                          <w:spacing w:before="0" w:after="0" w:line="240" w:lineRule="auto"/>
+                          <w:jc w:val="left"/>
+                        </w:pPr>
+                        <w:r>
+                          <w:rPr>
+                            <w:rFonts w:ascii="Arial" w:hAnsi="Arial" w:eastAsia="Malgun Gothic" w:cs="Arial"/>
+                            <w:b/>
+                            <w:bCs/>
+                            <w:spacing w:val="7"/>
+                            <w:sz w:val="14"/>
+                            <w:szCs w:val="14"/>
+                          </w:rPr>
+                          <w:t xml:space="preserve">MyriadbyConcert.com</w:t>
+                        </w:r>
+                      </w:p>
+                    </w:txbxContent>
+                  </wps:txbx>
+                  <wps:bodyPr rot="0" vert="horz" wrap="none" lIns="0" tIns="0" rIns="0" bIns="0" anchor="ctr" anchorCtr="0">
+                    <a:noAutofit/>
+                  </wps:bodyPr>
+                </wps:wsp>
+              </a:graphicData>
+            </a:graphic>
+          </wp:anchor>
+        </w:drawing>
+      </w:r>
+      <w:r>
+        <w:drawing>
+          <wp:anchor distT="0" distB="0" distL="0" distR="0" simplePos="0" relativeHeight="5015" behindDoc="0" locked="0" layoutInCell="1" allowOverlap="1">
+            <wp:simplePos x="0" y="0"/>
+            <wp:positionH relativeFrom="page">
+              <wp:posOffset>1073083</wp:posOffset>
+            </wp:positionH>
+            <wp:positionV relativeFrom="page">
+              <wp:posOffset>8912302</wp:posOffset>
+            </wp:positionV>
+            <wp:extent cx="2555889" cy="116979"/>
+            <wp:effectExtent l="0" t="0" r="0" b="0"/>
+            <wp:wrapNone/>
+            <wp:docPr id="5015" name="Text 5015"/>
+            <wp:cNvGraphicFramePr/>
+            <a:graphic>
+              <a:graphicData uri="http://schemas.microsoft.com/office/word/2010/wordprocessingShape">
+                <wps:wsp>
+                  <wps:cNvSpPr txBox="1"/>
+                  <wps:spPr>
+                    <a:xfrm>
+                      <a:off x="0" y="0"/>
+                      <a:ext cx="2555889" cy="116979"/>
+                    </a:xfrm>
+                    <a:prstGeom prst="rect">
+                      <a:avLst/>
+                    </a:prstGeom>
+                    <a:noFill/>
+                    <a:ln>
+                      <a:noFill/>
+                    </a:ln>
+                  </wps:spPr>
+                  <wps:txbx>
+                    <w:txbxContent>
+                      <w:p>
+                        <w:pPr>
+                          <w:spacing w:before="0" w:after="0" w:line="240" w:lineRule="auto"/>
+                          <w:jc w:val="left"/>
+                        </w:pPr>
+                        <w:r>
+                          <w:rPr>
+                            <w:rFonts w:ascii="Arial" w:hAnsi="Arial" w:eastAsia="Malgun Gothic" w:cs="Arial"/>
+                            <w:spacing w:val="7"/>
+                            <w:sz w:val="15"/>
+                            <w:szCs w:val="15"/>
+                          </w:rPr>
+                          <w:t xml:space="preserve">101 - 511 Clarke Road, Coquitlam, BC V3J 0/1</w:t>
+                        </w:r>
+                      </w:p>
+                    </w:txbxContent>
+                  </wps:txbx>
+                  <wps:bodyPr rot="0" vert="horz" wrap="none" lIns="0" tIns="0" rIns="0" bIns="0" anchor="ctr" anchorCtr="0">
+                    <a:noAutofit/>
+                  </wps:bodyPr>
+                </wps:wsp>
+              </a:graphicData>
+            </a:graphic>
+          </wp:anchor>
+        </w:drawing>
+      </w:r>
+      <w:r>
+        <w:drawing>
+          <wp:anchor distT="0" distB="0" distL="0" distR="0" simplePos="0" relativeHeight="5016" behindDoc="0" locked="0" layoutInCell="1" allowOverlap="1">
+            <wp:simplePos x="0" y="0"/>
+            <wp:positionH relativeFrom="page">
+              <wp:posOffset>1065631</wp:posOffset>
+            </wp:positionH>
+            <wp:positionV relativeFrom="page">
+              <wp:posOffset>9052553</wp:posOffset>
+            </wp:positionV>
+            <wp:extent cx="3127455" cy="114300"/>
+            <wp:effectExtent l="0" t="0" r="0" b="0"/>
+            <wp:wrapNone/>
+            <wp:docPr id="5016" name="Text 5016"/>
+            <wp:cNvGraphicFramePr/>
+            <a:graphic>
+              <a:graphicData uri="http://schemas.microsoft.com/office/word/2010/wordprocessingShape">
+                <wps:wsp>
+                  <wps:cNvSpPr txBox="1"/>
+                  <wps:spPr>
+                    <a:xfrm>
+                      <a:off x="0" y="0"/>
+                      <a:ext cx="3127455" cy="114300"/>
+                    </a:xfrm>
+                    <a:prstGeom prst="rect">
+                      <a:avLst/>
+                    </a:prstGeom>
+                    <a:noFill/>
+                    <a:ln>
+                      <a:noFill/>
+                    </a:ln>
+                  </wps:spPr>
+                  <wps:txbx>
+                    <w:txbxContent>
+                      <w:p>
+                        <w:pPr>
+                          <w:spacing w:before="0" w:after="0" w:line="240" w:lineRule="auto"/>
+                          <w:jc w:val="left"/>
+                        </w:pPr>
+                        <w:r>
+                          <w:rPr>
+                            <w:rFonts w:ascii="Arial" w:hAnsi="Arial" w:eastAsia="Malgun Gothic" w:cs="Arial"/>
+                            <w:sz w:val="15"/>
+                            <w:szCs w:val="15"/>
+                          </w:rPr>
+                          <w:t xml:space="preserve">604.335.0696 | Admin.Myriad@ConcertProperties.com</w:t>
+                        </w:r>
+                      </w:p>
+                    </w:txbxContent>
+                  </wps:txbx>
+                  <wps:bodyPr rot="0" vert="horz" wrap="none" lIns="0" tIns="0" rIns="0" bIns="0" anchor="ctr" anchorCtr="0">
+                    <a:noAutofit/>
+                  </wps:bodyPr>
+                </wps:wsp>
+              </a:graphicData>
+            </a:graphic>
+          </wp:anchor>
+        </w:drawing>
+      </w:r>
+      <w:r>
+        <w:drawing>
+          <wp:anchor distT="0" distB="0" distL="0" distR="0" simplePos="0" relativeHeight="5017" behindDoc="0" locked="0" layoutInCell="1" allowOverlap="1">
+            <wp:simplePos x="0" y="0"/>
+            <wp:positionH relativeFrom="page">
+              <wp:posOffset>5827437</wp:posOffset>
+            </wp:positionH>
+            <wp:positionV relativeFrom="page">
+              <wp:posOffset>9004801</wp:posOffset>
+            </wp:positionV>
+            <wp:extent cx="1475932" cy="209804"/>
+            <wp:effectExtent l="0" t="0" r="0" b="0"/>
+            <wp:wrapNone/>
+            <wp:docPr id="5017" name="Text 5017"/>
+            <wp:cNvGraphicFramePr/>
+            <a:graphic>
+              <a:graphicData uri="http://schemas.microsoft.com/office/word/2010/wordprocessingShape">
+                <wps:wsp>
+                  <wps:cNvSpPr txBox="1"/>
+                  <wps:spPr>
+                    <a:xfrm>
+                      <a:off x="0" y="0"/>
+                      <a:ext cx="1475932" cy="209804"/>
+                    </a:xfrm>
+                    <a:prstGeom prst="rect">
+                      <a:avLst/>
+                    </a:prstGeom>
+                    <a:noFill/>
+                    <a:ln>
+                      <a:noFill/>
+                    </a:ln>
+                  </wps:spPr>
+                  <wps:txbx>
+                    <w:txbxContent>
+                      <w:p>
+                        <w:pPr>
+                          <w:spacing w:before="0" w:after="0" w:line="240" w:lineRule="auto"/>
+                          <w:jc w:val="left"/>
+                        </w:pPr>
+                        <w:r>
+                          <w:rPr>
+                            <w:rFonts w:ascii="Arial" w:hAnsi="Arial" w:eastAsia="Malgun Gothic" w:cs="Arial"/>
+                            <w:b/>
+                            <w:bCs/>
+                            <w:sz w:val="28"/>
+                            <w:szCs w:val="28"/>
+                          </w:rPr>
+                          <w:t xml:space="preserve">CONCERT'</w:t>
+                        </w:r>
+                      </w:p>
+                    </w:txbxContent>
+                  </wps:txbx>
+                  <wps:bodyPr rot="0" vert="horz" wrap="none" lIns="0" tIns="0" rIns="0" bIns="0" anchor="ctr" anchorCtr="0">
+                    <a:noAutofit/>
+                  </wps:bodyPr>
+                </wps:wsp>
+              </a:graphicData>
+            </a:graphic>
+          </wp:anchor>
+        </w:drawing>
       </w:r>
     </w:p>
     <w:p>

</xml_diff>